<commit_message>
added really high level description of generator
</commit_message>
<xml_diff>
--- a/java/G45HW2form.docx
+++ b/java/G45HW2form.docx
@@ -1,15 +1,12 @@
 
 <file path=word/document.xml><?xml version="1.0" encoding="utf-8"?>
-<w:document xmlns:o="urn:schemas-microsoft-com:office:office" xmlns:r="http://schemas.openxmlformats.org/officeDocument/2006/relationships" xmlns:v="urn:schemas-microsoft-com:vml" xmlns:w="http://schemas.openxmlformats.org/wordprocessingml/2006/main" xmlns:w10="urn:schemas-microsoft-com:office:word" xmlns:wp="http://schemas.openxmlformats.org/drawingml/2006/wordprocessingDrawing" xmlns:pic="http://schemas.openxmlformats.org/drawingml/2006/picture" xmlns:wps="http://schemas.microsoft.com/office/word/2010/wordprocessingShape" xmlns:wpg="http://schemas.microsoft.com/office/word/2010/wordprocessingGroup" xmlns:mc="http://schemas.openxmlformats.org/markup-compatibility/2006" xmlns:wp14="http://schemas.microsoft.com/office/word/2010/wordprocessingDrawing" xmlns:w14="http://schemas.microsoft.com/office/word/2010/wordml" xmlns:w15="http://schemas.microsoft.com/office/word/2012/wordml" mc:Ignorable="w14 wp14 w15">
+<w:document xmlns:wpc="http://schemas.microsoft.com/office/word/2010/wordprocessingCanvas" xmlns:cx="http://schemas.microsoft.com/office/drawing/2014/chartex" xmlns:cx1="http://schemas.microsoft.com/office/drawing/2015/9/8/chartex" xmlns:cx2="http://schemas.microsoft.com/office/drawing/2015/10/21/chartex" xmlns:cx3="http://schemas.microsoft.com/office/drawing/2016/5/9/chartex" xmlns:cx4="http://schemas.microsoft.com/office/drawing/2016/5/10/chartex" xmlns:cx5="http://schemas.microsoft.com/office/drawing/2016/5/11/chartex" xmlns:cx6="http://schemas.microsoft.com/office/drawing/2016/5/12/chartex" xmlns:cx7="http://schemas.microsoft.com/office/drawing/2016/5/13/chartex" xmlns:cx8="http://schemas.microsoft.com/office/drawing/2016/5/14/chartex" xmlns:mc="http://schemas.openxmlformats.org/markup-compatibility/2006" xmlns:aink="http://schemas.microsoft.com/office/drawing/2016/ink" xmlns:am3d="http://schemas.microsoft.com/office/drawing/2017/model3d" xmlns:o="urn:schemas-microsoft-com:office:office" xmlns:oel="http://schemas.microsoft.com/office/2019/extlst" xmlns:r="http://schemas.openxmlformats.org/officeDocument/2006/relationships" xmlns:m="http://schemas.openxmlformats.org/officeDocument/2006/math" xmlns:v="urn:schemas-microsoft-com:vml" xmlns:wp14="http://schemas.microsoft.com/office/word/2010/wordprocessingDrawing" xmlns:wp="http://schemas.openxmlformats.org/drawingml/2006/wordprocessingDrawing" xmlns:w10="urn:schemas-microsoft-com:office:word" xmlns:w="http://schemas.openxmlformats.org/wordprocessingml/2006/main" xmlns:w14="http://schemas.microsoft.com/office/word/2010/wordml" xmlns:w15="http://schemas.microsoft.com/office/word/2012/wordml" xmlns:w16cex="http://schemas.microsoft.com/office/word/2018/wordml/cex" xmlns:w16cid="http://schemas.microsoft.com/office/word/2016/wordml/cid" xmlns:w16="http://schemas.microsoft.com/office/word/2018/wordml" xmlns:w16du="http://schemas.microsoft.com/office/word/2023/wordml/word16du" xmlns:w16sdtdh="http://schemas.microsoft.com/office/word/2020/wordml/sdtdatahash" xmlns:w16sdtfl="http://schemas.microsoft.com/office/word/2024/wordml/sdtformatlock" xmlns:w16se="http://schemas.microsoft.com/office/word/2015/wordml/symex" xmlns:wpg="http://schemas.microsoft.com/office/word/2010/wordprocessingGroup" xmlns:wpi="http://schemas.microsoft.com/office/word/2010/wordprocessingInk" xmlns:wne="http://schemas.microsoft.com/office/word/2006/wordml" xmlns:wps="http://schemas.microsoft.com/office/word/2010/wordprocessingShape" mc:Ignorable="w14 w15 w16se w16cid w16 w16cex w16sdtdh w16sdtfl w16du wp14">
   <w:body>
     <w:p>
       <w:pPr>
-        <w:pStyle w:val="Normal"/>
-        <w:rPr>
-          <w:color w:val="FF0000"/>
-          <w:sz w:val="20"/>
-          <w:szCs w:val="20"/>
-          <w:lang w:val="en-US"/>
+        <w:rPr>
+          <w:sz w:val="20"/>
+          <w:szCs w:val="20"/>
         </w:rPr>
       </w:pPr>
       <w:r>
@@ -17,28 +14,23 @@
           <w:b/>
           <w:sz w:val="20"/>
           <w:szCs w:val="20"/>
-          <w:lang w:val="en-US"/>
         </w:rPr>
         <w:t xml:space="preserve">GROUP NUMBER: </w:t>
       </w:r>
       <w:r>
         <w:rPr>
-          <w:color w:val="FF0000"/>
-          <w:sz w:val="20"/>
-          <w:szCs w:val="20"/>
-          <w:lang w:val="en-US"/>
-        </w:rPr>
-        <w:t>fill in your group number</w:t>
+          <w:sz w:val="20"/>
+          <w:szCs w:val="20"/>
+        </w:rPr>
+        <w:t>45</w:t>
       </w:r>
     </w:p>
     <w:p>
       <w:pPr>
-        <w:pStyle w:val="Normal"/>
         <w:rPr>
           <w:color w:val="FF0000"/>
           <w:sz w:val="20"/>
           <w:szCs w:val="20"/>
-          <w:lang w:val="en-US"/>
         </w:rPr>
       </w:pPr>
       <w:r>
@@ -46,7 +38,6 @@
           <w:b/>
           <w:sz w:val="20"/>
           <w:szCs w:val="20"/>
-          <w:lang w:val="en-US"/>
         </w:rPr>
         <w:t xml:space="preserve">GROUP MEMBERS: </w:t>
       </w:r>
@@ -56,14 +47,12 @@
           <w:color w:val="000000"/>
           <w:sz w:val="20"/>
           <w:szCs w:val="20"/>
-          <w:lang w:val="en-US"/>
         </w:rPr>
         <w:t>Giovanni Gaio, Giordano Grigolato, Simone Moretti</w:t>
       </w:r>
     </w:p>
     <w:p>
       <w:pPr>
-        <w:pStyle w:val="Normal"/>
         <w:rPr>
           <w:sz w:val="20"/>
           <w:szCs w:val="20"/>
@@ -115,7 +104,6 @@
     </w:p>
     <w:p>
       <w:pPr>
-        <w:pStyle w:val="Normal"/>
         <w:rPr>
           <w:sz w:val="20"/>
           <w:szCs w:val="20"/>
@@ -151,7 +139,6 @@
     </w:p>
     <w:p>
       <w:pPr>
-        <w:pStyle w:val="Normal"/>
         <w:rPr>
           <w:sz w:val="20"/>
           <w:szCs w:val="20"/>
@@ -178,7 +165,6 @@
     </w:p>
     <w:p>
       <w:pPr>
-        <w:pStyle w:val="Normal"/>
         <w:rPr>
           <w:b/>
           <w:bCs/>
@@ -199,8 +185,6 @@
       </w:r>
       <w:r>
         <w:rPr>
-          <w:b w:val="false"/>
-          <w:bCs w:val="false"/>
           <w:i/>
           <w:iCs/>
           <w:sz w:val="20"/>
@@ -212,41 +196,30 @@
     </w:p>
     <w:tbl>
       <w:tblPr>
-        <w:tblStyle w:val="TableGrid"/>
+        <w:tblStyle w:val="Grigliatabella"/>
         <w:tblW w:w="7650" w:type="dxa"/>
-        <w:jc w:val="left"/>
-        <w:tblInd w:w="0" w:type="dxa"/>
         <w:tblLayout w:type="fixed"/>
-        <w:tblCellMar>
-          <w:top w:w="0" w:type="dxa"/>
-          <w:left w:w="108" w:type="dxa"/>
-          <w:bottom w:w="0" w:type="dxa"/>
-          <w:right w:w="108" w:type="dxa"/>
-        </w:tblCellMar>
-        <w:tblLook w:val="04a0" w:noHBand="0" w:noVBand="1" w:firstColumn="1" w:lastRow="0" w:lastColumn="0" w:firstRow="1"/>
+        <w:tblLook w:val="04A0" w:firstRow="1" w:lastRow="0" w:firstColumn="1" w:lastColumn="0" w:noHBand="0" w:noVBand="1"/>
       </w:tblPr>
       <w:tblGrid>
-        <w:gridCol w:w="1270"/>
+        <w:gridCol w:w="1271"/>
         <w:gridCol w:w="1844"/>
         <w:gridCol w:w="1843"/>
         <w:gridCol w:w="2692"/>
       </w:tblGrid>
       <w:tr>
         <w:trPr>
-          <w:trHeight w:val="20" w:hRule="atLeast"/>
+          <w:trHeight w:val="20"/>
         </w:trPr>
         <w:tc>
           <w:tcPr>
             <w:tcW w:w="7649" w:type="dxa"/>
             <w:gridSpan w:val="4"/>
-            <w:tcBorders/>
             <w:vAlign w:val="center"/>
           </w:tcPr>
           <w:p>
             <w:pPr>
-              <w:pStyle w:val="Normal"/>
-              <w:widowControl/>
-              <w:spacing w:lineRule="auto" w:line="240" w:before="0" w:after="0"/>
+              <w:spacing w:after="0" w:line="240" w:lineRule="auto"/>
               <w:jc w:val="center"/>
               <w:rPr>
                 <w:b/>
@@ -257,13 +230,12 @@
             </w:pPr>
             <w:r>
               <w:rPr>
-                <w:rFonts w:eastAsia="Calibri" w:cs=""/>
+                <w:rFonts w:eastAsia="Calibri"/>
                 <w:b/>
                 <w:color w:val="FF0000"/>
-                <w:kern w:val="0"/>
                 <w:sz w:val="20"/>
                 <w:szCs w:val="20"/>
-                <w:lang w:val="en-US" w:eastAsia="en-US" w:bidi="ar-SA"/>
+                <w:lang w:val="en-US"/>
               </w:rPr>
               <w:t>SCALABILITY WITH RESPECT TO NUMBER OF EXECUTORS</w:t>
             </w:r>
@@ -272,19 +244,15 @@
       </w:tr>
       <w:tr>
         <w:trPr>
-          <w:trHeight w:val="20" w:hRule="atLeast"/>
+          <w:trHeight w:val="20"/>
         </w:trPr>
         <w:tc>
           <w:tcPr>
             <w:tcW w:w="1270" w:type="dxa"/>
-            <w:tcBorders/>
           </w:tcPr>
           <w:p>
             <w:pPr>
-              <w:pStyle w:val="Normal"/>
-              <w:widowControl/>
-              <w:spacing w:lineRule="auto" w:line="240" w:before="0" w:after="0"/>
-              <w:jc w:val="left"/>
+              <w:spacing w:after="0" w:line="240" w:lineRule="auto"/>
               <w:rPr>
                 <w:b/>
                 <w:bCs/>
@@ -292,13 +260,9 @@
             </w:pPr>
             <w:r>
               <w:rPr>
-                <w:rFonts w:eastAsia="Calibri" w:cs=""/>
+                <w:rFonts w:eastAsia="Calibri"/>
                 <w:b/>
                 <w:bCs/>
-                <w:kern w:val="0"/>
-                <w:sz w:val="22"/>
-                <w:szCs w:val="22"/>
-                <w:lang w:val="it-IT" w:eastAsia="en-US" w:bidi="ar-SA"/>
               </w:rPr>
               <w:t>Number of executors</w:t>
             </w:r>
@@ -307,14 +271,10 @@
         <w:tc>
           <w:tcPr>
             <w:tcW w:w="1844" w:type="dxa"/>
-            <w:tcBorders/>
           </w:tcPr>
           <w:p>
             <w:pPr>
-              <w:pStyle w:val="Normal"/>
-              <w:widowControl/>
-              <w:spacing w:lineRule="auto" w:line="240" w:before="0" w:after="0"/>
-              <w:jc w:val="left"/>
+              <w:spacing w:after="0" w:line="240" w:lineRule="auto"/>
               <w:rPr>
                 <w:b/>
                 <w:bCs/>
@@ -322,40 +282,21 @@
             </w:pPr>
             <w:r>
               <w:rPr>
-                <w:rFonts w:eastAsia="Calibri" w:cs=""/>
+                <w:rFonts w:eastAsia="Calibri"/>
                 <w:b/>
                 <w:bCs/>
-                <w:kern w:val="0"/>
-                <w:sz w:val="22"/>
-                <w:szCs w:val="22"/>
-                <w:lang w:val="it-IT" w:eastAsia="en-US" w:bidi="ar-SA"/>
-              </w:rPr>
-              <w:t xml:space="preserve"> </w:t>
-            </w:r>
-            <w:r>
-              <w:rPr>
-                <w:rFonts w:eastAsia="Calibri" w:cs=""/>
-                <w:b/>
-                <w:bCs/>
-                <w:kern w:val="0"/>
-                <w:sz w:val="22"/>
-                <w:szCs w:val="22"/>
-                <w:lang w:val="it-IT" w:eastAsia="en-US" w:bidi="ar-SA"/>
-              </w:rPr>
-              <w:t>Spark Lloyd’s implementation</w:t>
+              </w:rPr>
+              <w:t xml:space="preserve"> Spark Lloyd’s implementation</w:t>
             </w:r>
           </w:p>
         </w:tc>
         <w:tc>
           <w:tcPr>
             <w:tcW w:w="1843" w:type="dxa"/>
-            <w:tcBorders/>
           </w:tcPr>
           <w:p>
             <w:pPr>
-              <w:pStyle w:val="Normal"/>
-              <w:widowControl/>
-              <w:spacing w:lineRule="auto" w:line="240" w:before="0" w:after="0"/>
+              <w:spacing w:after="0" w:line="240" w:lineRule="auto"/>
               <w:jc w:val="center"/>
               <w:rPr>
                 <w:b/>
@@ -364,13 +305,9 @@
             </w:pPr>
             <w:r>
               <w:rPr>
-                <w:rFonts w:eastAsia="Calibri" w:cs=""/>
+                <w:rFonts w:eastAsia="Calibri"/>
                 <w:b/>
                 <w:bCs/>
-                <w:kern w:val="0"/>
-                <w:sz w:val="22"/>
-                <w:szCs w:val="22"/>
-                <w:lang w:val="it-IT" w:eastAsia="en-US" w:bidi="ar-SA"/>
               </w:rPr>
               <w:t>MRFairLloyd</w:t>
             </w:r>
@@ -379,14 +316,10 @@
         <w:tc>
           <w:tcPr>
             <w:tcW w:w="2692" w:type="dxa"/>
-            <w:tcBorders/>
           </w:tcPr>
           <w:p>
             <w:pPr>
-              <w:pStyle w:val="Normal"/>
-              <w:widowControl/>
-              <w:spacing w:lineRule="auto" w:line="240" w:before="0" w:after="0"/>
-              <w:jc w:val="left"/>
+              <w:spacing w:after="0" w:line="240" w:lineRule="auto"/>
               <w:rPr>
                 <w:b/>
                 <w:bCs/>
@@ -394,13 +327,9 @@
             </w:pPr>
             <w:r>
               <w:rPr>
-                <w:rFonts w:eastAsia="Calibri" w:cs=""/>
+                <w:rFonts w:eastAsia="Calibri"/>
                 <w:b/>
                 <w:bCs/>
-                <w:kern w:val="0"/>
-                <w:sz w:val="22"/>
-                <w:szCs w:val="22"/>
-                <w:lang w:val="it-IT" w:eastAsia="en-US" w:bidi="ar-SA"/>
               </w:rPr>
               <w:t xml:space="preserve">MRComputeFairObjective </w:t>
             </w:r>
@@ -409,34 +338,22 @@
       </w:tr>
       <w:tr>
         <w:trPr>
-          <w:trHeight w:val="20" w:hRule="atLeast"/>
+          <w:trHeight w:val="20"/>
         </w:trPr>
         <w:tc>
           <w:tcPr>
             <w:tcW w:w="1270" w:type="dxa"/>
-            <w:tcBorders/>
           </w:tcPr>
           <w:p>
             <w:pPr>
-              <w:pStyle w:val="Normal"/>
-              <w:widowControl/>
-              <w:spacing w:lineRule="auto" w:line="240" w:before="0" w:after="0"/>
-              <w:jc w:val="left"/>
-              <w:rPr>
-                <w:rFonts w:ascii="Calibri" w:hAnsi="Calibri" w:eastAsia="Calibri" w:cs=""/>
-                <w:kern w:val="0"/>
-                <w:sz w:val="22"/>
-                <w:szCs w:val="22"/>
-                <w:lang w:val="it-IT" w:eastAsia="en-US" w:bidi="ar-SA"/>
+              <w:spacing w:after="0" w:line="240" w:lineRule="auto"/>
+              <w:rPr>
+                <w:rFonts w:ascii="Calibri" w:eastAsia="Calibri" w:hAnsi="Calibri"/>
               </w:rPr>
             </w:pPr>
             <w:r>
               <w:rPr>
-                <w:rFonts w:eastAsia="Calibri" w:cs=""/>
-                <w:kern w:val="0"/>
-                <w:sz w:val="22"/>
-                <w:szCs w:val="22"/>
-                <w:lang w:val="it-IT" w:eastAsia="en-US" w:bidi="ar-SA"/>
+                <w:rFonts w:eastAsia="Calibri"/>
               </w:rPr>
               <w:t>2</w:t>
             </w:r>
@@ -445,29 +362,17 @@
         <w:tc>
           <w:tcPr>
             <w:tcW w:w="1844" w:type="dxa"/>
-            <w:tcBorders/>
           </w:tcPr>
           <w:p>
             <w:pPr>
-              <w:pStyle w:val="Normal"/>
-              <w:widowControl/>
-              <w:spacing w:lineRule="auto" w:line="240" w:before="0" w:after="0"/>
-              <w:jc w:val="left"/>
-              <w:rPr>
-                <w:rFonts w:ascii="Calibri" w:hAnsi="Calibri" w:eastAsia="Calibri" w:cs=""/>
-                <w:kern w:val="0"/>
-                <w:sz w:val="22"/>
-                <w:szCs w:val="22"/>
-                <w:lang w:val="it-IT" w:eastAsia="en-US" w:bidi="ar-SA"/>
+              <w:spacing w:after="0" w:line="240" w:lineRule="auto"/>
+              <w:rPr>
+                <w:rFonts w:ascii="Calibri" w:eastAsia="Calibri" w:hAnsi="Calibri"/>
               </w:rPr>
             </w:pPr>
             <w:r>
               <w:rPr>
-                <w:rFonts w:eastAsia="Calibri" w:cs=""/>
-                <w:kern w:val="0"/>
-                <w:sz w:val="22"/>
-                <w:szCs w:val="22"/>
-                <w:lang w:val="it-IT" w:eastAsia="en-US" w:bidi="ar-SA"/>
+                <w:rFonts w:eastAsia="Calibri"/>
               </w:rPr>
               <w:t>13545</w:t>
             </w:r>
@@ -476,29 +381,17 @@
         <w:tc>
           <w:tcPr>
             <w:tcW w:w="1843" w:type="dxa"/>
-            <w:tcBorders/>
           </w:tcPr>
           <w:p>
             <w:pPr>
-              <w:pStyle w:val="Normal"/>
-              <w:widowControl/>
-              <w:spacing w:lineRule="auto" w:line="240" w:before="0" w:after="0"/>
-              <w:jc w:val="left"/>
-              <w:rPr>
-                <w:rFonts w:ascii="Calibri" w:hAnsi="Calibri" w:eastAsia="Calibri" w:cs=""/>
-                <w:kern w:val="0"/>
-                <w:sz w:val="22"/>
-                <w:szCs w:val="22"/>
-                <w:lang w:val="it-IT" w:eastAsia="en-US" w:bidi="ar-SA"/>
+              <w:spacing w:after="0" w:line="240" w:lineRule="auto"/>
+              <w:rPr>
+                <w:rFonts w:ascii="Calibri" w:eastAsia="Calibri" w:hAnsi="Calibri"/>
               </w:rPr>
             </w:pPr>
             <w:r>
               <w:rPr>
-                <w:rFonts w:eastAsia="Calibri" w:cs=""/>
-                <w:kern w:val="0"/>
-                <w:sz w:val="22"/>
-                <w:szCs w:val="22"/>
-                <w:lang w:val="it-IT" w:eastAsia="en-US" w:bidi="ar-SA"/>
+                <w:rFonts w:eastAsia="Calibri"/>
               </w:rPr>
               <w:t>54760</w:t>
             </w:r>
@@ -507,29 +400,17 @@
         <w:tc>
           <w:tcPr>
             <w:tcW w:w="2692" w:type="dxa"/>
-            <w:tcBorders/>
           </w:tcPr>
           <w:p>
             <w:pPr>
-              <w:pStyle w:val="Normal"/>
-              <w:widowControl/>
-              <w:spacing w:lineRule="auto" w:line="240" w:before="0" w:after="0"/>
-              <w:jc w:val="left"/>
-              <w:rPr>
-                <w:rFonts w:ascii="Calibri" w:hAnsi="Calibri" w:eastAsia="Calibri" w:cs=""/>
-                <w:kern w:val="0"/>
-                <w:sz w:val="22"/>
-                <w:szCs w:val="22"/>
-                <w:lang w:val="it-IT" w:eastAsia="en-US" w:bidi="ar-SA"/>
+              <w:spacing w:after="0" w:line="240" w:lineRule="auto"/>
+              <w:rPr>
+                <w:rFonts w:ascii="Calibri" w:eastAsia="Calibri" w:hAnsi="Calibri"/>
               </w:rPr>
             </w:pPr>
             <w:r>
               <w:rPr>
-                <w:rFonts w:eastAsia="Calibri" w:cs=""/>
-                <w:kern w:val="0"/>
-                <w:sz w:val="22"/>
-                <w:szCs w:val="22"/>
-                <w:lang w:val="it-IT" w:eastAsia="en-US" w:bidi="ar-SA"/>
+                <w:rFonts w:eastAsia="Calibri"/>
               </w:rPr>
               <w:t>1388</w:t>
             </w:r>
@@ -538,34 +419,22 @@
       </w:tr>
       <w:tr>
         <w:trPr>
-          <w:trHeight w:val="20" w:hRule="atLeast"/>
+          <w:trHeight w:val="20"/>
         </w:trPr>
         <w:tc>
           <w:tcPr>
             <w:tcW w:w="1270" w:type="dxa"/>
-            <w:tcBorders/>
           </w:tcPr>
           <w:p>
             <w:pPr>
-              <w:pStyle w:val="Normal"/>
-              <w:widowControl/>
-              <w:spacing w:lineRule="auto" w:line="240" w:before="0" w:after="0"/>
-              <w:jc w:val="left"/>
-              <w:rPr>
-                <w:rFonts w:ascii="Calibri" w:hAnsi="Calibri" w:eastAsia="Calibri" w:cs=""/>
-                <w:kern w:val="0"/>
-                <w:sz w:val="22"/>
-                <w:szCs w:val="22"/>
-                <w:lang w:val="it-IT" w:eastAsia="en-US" w:bidi="ar-SA"/>
+              <w:spacing w:after="0" w:line="240" w:lineRule="auto"/>
+              <w:rPr>
+                <w:rFonts w:ascii="Calibri" w:eastAsia="Calibri" w:hAnsi="Calibri"/>
               </w:rPr>
             </w:pPr>
             <w:r>
               <w:rPr>
-                <w:rFonts w:eastAsia="Calibri" w:cs=""/>
-                <w:kern w:val="0"/>
-                <w:sz w:val="22"/>
-                <w:szCs w:val="22"/>
-                <w:lang w:val="it-IT" w:eastAsia="en-US" w:bidi="ar-SA"/>
+                <w:rFonts w:eastAsia="Calibri"/>
               </w:rPr>
               <w:t>4</w:t>
             </w:r>
@@ -574,29 +443,17 @@
         <w:tc>
           <w:tcPr>
             <w:tcW w:w="1844" w:type="dxa"/>
-            <w:tcBorders/>
           </w:tcPr>
           <w:p>
             <w:pPr>
-              <w:pStyle w:val="Normal"/>
-              <w:widowControl/>
-              <w:spacing w:lineRule="auto" w:line="240" w:before="0" w:after="0"/>
-              <w:jc w:val="left"/>
-              <w:rPr>
-                <w:rFonts w:ascii="Calibri" w:hAnsi="Calibri" w:eastAsia="Calibri" w:cs=""/>
-                <w:kern w:val="0"/>
-                <w:sz w:val="22"/>
-                <w:szCs w:val="22"/>
-                <w:lang w:val="it-IT" w:eastAsia="en-US" w:bidi="ar-SA"/>
+              <w:spacing w:after="0" w:line="240" w:lineRule="auto"/>
+              <w:rPr>
+                <w:rFonts w:ascii="Calibri" w:eastAsia="Calibri" w:hAnsi="Calibri"/>
               </w:rPr>
             </w:pPr>
             <w:r>
               <w:rPr>
-                <w:rFonts w:eastAsia="Calibri" w:cs=""/>
-                <w:kern w:val="0"/>
-                <w:sz w:val="22"/>
-                <w:szCs w:val="22"/>
-                <w:lang w:val="it-IT" w:eastAsia="en-US" w:bidi="ar-SA"/>
+                <w:rFonts w:eastAsia="Calibri"/>
               </w:rPr>
               <w:t>8441</w:t>
             </w:r>
@@ -605,29 +462,17 @@
         <w:tc>
           <w:tcPr>
             <w:tcW w:w="1843" w:type="dxa"/>
-            <w:tcBorders/>
           </w:tcPr>
           <w:p>
             <w:pPr>
-              <w:pStyle w:val="Normal"/>
-              <w:widowControl/>
-              <w:spacing w:lineRule="auto" w:line="240" w:before="0" w:after="0"/>
-              <w:jc w:val="left"/>
-              <w:rPr>
-                <w:rFonts w:ascii="Calibri" w:hAnsi="Calibri" w:eastAsia="Calibri" w:cs=""/>
-                <w:kern w:val="0"/>
-                <w:sz w:val="22"/>
-                <w:szCs w:val="22"/>
-                <w:lang w:val="it-IT" w:eastAsia="en-US" w:bidi="ar-SA"/>
+              <w:spacing w:after="0" w:line="240" w:lineRule="auto"/>
+              <w:rPr>
+                <w:rFonts w:ascii="Calibri" w:eastAsia="Calibri" w:hAnsi="Calibri"/>
               </w:rPr>
             </w:pPr>
             <w:r>
               <w:rPr>
-                <w:rFonts w:eastAsia="Calibri" w:cs=""/>
-                <w:kern w:val="0"/>
-                <w:sz w:val="22"/>
-                <w:szCs w:val="22"/>
-                <w:lang w:val="it-IT" w:eastAsia="en-US" w:bidi="ar-SA"/>
+                <w:rFonts w:eastAsia="Calibri"/>
               </w:rPr>
               <w:t>26475</w:t>
             </w:r>
@@ -636,29 +481,17 @@
         <w:tc>
           <w:tcPr>
             <w:tcW w:w="2692" w:type="dxa"/>
-            <w:tcBorders/>
           </w:tcPr>
           <w:p>
             <w:pPr>
-              <w:pStyle w:val="Normal"/>
-              <w:widowControl/>
-              <w:spacing w:lineRule="auto" w:line="240" w:before="0" w:after="0"/>
-              <w:jc w:val="left"/>
-              <w:rPr>
-                <w:rFonts w:ascii="Calibri" w:hAnsi="Calibri" w:eastAsia="Calibri" w:cs=""/>
-                <w:kern w:val="0"/>
-                <w:sz w:val="22"/>
-                <w:szCs w:val="22"/>
-                <w:lang w:val="it-IT" w:eastAsia="en-US" w:bidi="ar-SA"/>
+              <w:spacing w:after="0" w:line="240" w:lineRule="auto"/>
+              <w:rPr>
+                <w:rFonts w:ascii="Calibri" w:eastAsia="Calibri" w:hAnsi="Calibri"/>
               </w:rPr>
             </w:pPr>
             <w:r>
               <w:rPr>
-                <w:rFonts w:eastAsia="Calibri" w:cs=""/>
-                <w:kern w:val="0"/>
-                <w:sz w:val="22"/>
-                <w:szCs w:val="22"/>
-                <w:lang w:val="it-IT" w:eastAsia="en-US" w:bidi="ar-SA"/>
+                <w:rFonts w:eastAsia="Calibri"/>
               </w:rPr>
               <w:t>655</w:t>
             </w:r>
@@ -667,34 +500,22 @@
       </w:tr>
       <w:tr>
         <w:trPr>
-          <w:trHeight w:val="20" w:hRule="atLeast"/>
+          <w:trHeight w:val="20"/>
         </w:trPr>
         <w:tc>
           <w:tcPr>
             <w:tcW w:w="1270" w:type="dxa"/>
-            <w:tcBorders/>
           </w:tcPr>
           <w:p>
             <w:pPr>
-              <w:pStyle w:val="Normal"/>
-              <w:widowControl/>
-              <w:spacing w:lineRule="auto" w:line="240" w:before="0" w:after="0"/>
-              <w:jc w:val="left"/>
-              <w:rPr>
-                <w:rFonts w:ascii="Calibri" w:hAnsi="Calibri" w:eastAsia="Calibri" w:cs=""/>
-                <w:kern w:val="0"/>
-                <w:sz w:val="22"/>
-                <w:szCs w:val="22"/>
-                <w:lang w:val="it-IT" w:eastAsia="en-US" w:bidi="ar-SA"/>
+              <w:spacing w:after="0" w:line="240" w:lineRule="auto"/>
+              <w:rPr>
+                <w:rFonts w:ascii="Calibri" w:eastAsia="Calibri" w:hAnsi="Calibri"/>
               </w:rPr>
             </w:pPr>
             <w:r>
               <w:rPr>
-                <w:rFonts w:eastAsia="Calibri" w:cs=""/>
-                <w:kern w:val="0"/>
-                <w:sz w:val="22"/>
-                <w:szCs w:val="22"/>
-                <w:lang w:val="it-IT" w:eastAsia="en-US" w:bidi="ar-SA"/>
+                <w:rFonts w:eastAsia="Calibri"/>
               </w:rPr>
               <w:t>8</w:t>
             </w:r>
@@ -703,29 +524,17 @@
         <w:tc>
           <w:tcPr>
             <w:tcW w:w="1844" w:type="dxa"/>
-            <w:tcBorders/>
           </w:tcPr>
           <w:p>
             <w:pPr>
-              <w:pStyle w:val="Normal"/>
-              <w:widowControl/>
-              <w:spacing w:lineRule="auto" w:line="240" w:before="0" w:after="0"/>
-              <w:jc w:val="left"/>
-              <w:rPr>
-                <w:rFonts w:ascii="Calibri" w:hAnsi="Calibri" w:eastAsia="Calibri" w:cs=""/>
-                <w:kern w:val="0"/>
-                <w:sz w:val="22"/>
-                <w:szCs w:val="22"/>
-                <w:lang w:val="it-IT" w:eastAsia="en-US" w:bidi="ar-SA"/>
+              <w:spacing w:after="0" w:line="240" w:lineRule="auto"/>
+              <w:rPr>
+                <w:rFonts w:ascii="Calibri" w:eastAsia="Calibri" w:hAnsi="Calibri"/>
               </w:rPr>
             </w:pPr>
             <w:r>
               <w:rPr>
-                <w:rFonts w:eastAsia="Calibri" w:cs=""/>
-                <w:kern w:val="0"/>
-                <w:sz w:val="22"/>
-                <w:szCs w:val="22"/>
-                <w:lang w:val="it-IT" w:eastAsia="en-US" w:bidi="ar-SA"/>
+                <w:rFonts w:eastAsia="Calibri"/>
               </w:rPr>
               <w:t>4812</w:t>
             </w:r>
@@ -734,29 +543,17 @@
         <w:tc>
           <w:tcPr>
             <w:tcW w:w="1843" w:type="dxa"/>
-            <w:tcBorders/>
           </w:tcPr>
           <w:p>
             <w:pPr>
-              <w:pStyle w:val="Normal"/>
-              <w:widowControl/>
-              <w:spacing w:lineRule="auto" w:line="240" w:before="0" w:after="0"/>
-              <w:jc w:val="left"/>
-              <w:rPr>
-                <w:rFonts w:ascii="Calibri" w:hAnsi="Calibri" w:eastAsia="Calibri" w:cs=""/>
-                <w:kern w:val="0"/>
-                <w:sz w:val="22"/>
-                <w:szCs w:val="22"/>
-                <w:lang w:val="it-IT" w:eastAsia="en-US" w:bidi="ar-SA"/>
+              <w:spacing w:after="0" w:line="240" w:lineRule="auto"/>
+              <w:rPr>
+                <w:rFonts w:ascii="Calibri" w:eastAsia="Calibri" w:hAnsi="Calibri"/>
               </w:rPr>
             </w:pPr>
             <w:r>
               <w:rPr>
-                <w:rFonts w:eastAsia="Calibri" w:cs=""/>
-                <w:kern w:val="0"/>
-                <w:sz w:val="22"/>
-                <w:szCs w:val="22"/>
-                <w:lang w:val="it-IT" w:eastAsia="en-US" w:bidi="ar-SA"/>
+                <w:rFonts w:eastAsia="Calibri"/>
               </w:rPr>
               <w:t>16384</w:t>
             </w:r>
@@ -765,29 +562,17 @@
         <w:tc>
           <w:tcPr>
             <w:tcW w:w="2692" w:type="dxa"/>
-            <w:tcBorders/>
           </w:tcPr>
           <w:p>
             <w:pPr>
-              <w:pStyle w:val="Normal"/>
-              <w:widowControl/>
-              <w:spacing w:lineRule="auto" w:line="240" w:before="0" w:after="0"/>
-              <w:jc w:val="left"/>
-              <w:rPr>
-                <w:rFonts w:ascii="Calibri" w:hAnsi="Calibri" w:eastAsia="Calibri" w:cs=""/>
-                <w:kern w:val="0"/>
-                <w:sz w:val="22"/>
-                <w:szCs w:val="22"/>
-                <w:lang w:val="it-IT" w:eastAsia="en-US" w:bidi="ar-SA"/>
+              <w:spacing w:after="0" w:line="240" w:lineRule="auto"/>
+              <w:rPr>
+                <w:rFonts w:ascii="Calibri" w:eastAsia="Calibri" w:hAnsi="Calibri"/>
               </w:rPr>
             </w:pPr>
             <w:r>
               <w:rPr>
-                <w:rFonts w:eastAsia="Calibri" w:cs=""/>
-                <w:kern w:val="0"/>
-                <w:sz w:val="22"/>
-                <w:szCs w:val="22"/>
-                <w:lang w:val="it-IT" w:eastAsia="en-US" w:bidi="ar-SA"/>
+                <w:rFonts w:eastAsia="Calibri"/>
               </w:rPr>
               <w:t>465</w:t>
             </w:r>
@@ -796,34 +581,22 @@
       </w:tr>
       <w:tr>
         <w:trPr>
-          <w:trHeight w:val="20" w:hRule="atLeast"/>
+          <w:trHeight w:val="20"/>
         </w:trPr>
         <w:tc>
           <w:tcPr>
             <w:tcW w:w="1270" w:type="dxa"/>
-            <w:tcBorders/>
           </w:tcPr>
           <w:p>
             <w:pPr>
-              <w:pStyle w:val="Normal"/>
-              <w:widowControl/>
-              <w:spacing w:lineRule="auto" w:line="240" w:before="0" w:after="0"/>
-              <w:jc w:val="left"/>
-              <w:rPr>
-                <w:rFonts w:ascii="Calibri" w:hAnsi="Calibri" w:eastAsia="Calibri" w:cs=""/>
-                <w:kern w:val="0"/>
-                <w:sz w:val="22"/>
-                <w:szCs w:val="22"/>
-                <w:lang w:val="it-IT" w:eastAsia="en-US" w:bidi="ar-SA"/>
+              <w:spacing w:after="0" w:line="240" w:lineRule="auto"/>
+              <w:rPr>
+                <w:rFonts w:ascii="Calibri" w:eastAsia="Calibri" w:hAnsi="Calibri"/>
               </w:rPr>
             </w:pPr>
             <w:r>
               <w:rPr>
-                <w:rFonts w:eastAsia="Calibri" w:cs=""/>
-                <w:kern w:val="0"/>
-                <w:sz w:val="22"/>
-                <w:szCs w:val="22"/>
-                <w:lang w:val="it-IT" w:eastAsia="en-US" w:bidi="ar-SA"/>
+                <w:rFonts w:eastAsia="Calibri"/>
               </w:rPr>
               <w:t>16</w:t>
             </w:r>
@@ -832,29 +605,17 @@
         <w:tc>
           <w:tcPr>
             <w:tcW w:w="1844" w:type="dxa"/>
-            <w:tcBorders/>
           </w:tcPr>
           <w:p>
             <w:pPr>
-              <w:pStyle w:val="Normal"/>
-              <w:widowControl/>
-              <w:spacing w:lineRule="auto" w:line="240" w:before="0" w:after="0"/>
-              <w:jc w:val="left"/>
-              <w:rPr>
-                <w:rFonts w:ascii="Calibri" w:hAnsi="Calibri" w:eastAsia="Calibri" w:cs=""/>
-                <w:kern w:val="0"/>
-                <w:sz w:val="22"/>
-                <w:szCs w:val="22"/>
-                <w:lang w:val="it-IT" w:eastAsia="en-US" w:bidi="ar-SA"/>
+              <w:spacing w:after="0" w:line="240" w:lineRule="auto"/>
+              <w:rPr>
+                <w:rFonts w:ascii="Calibri" w:eastAsia="Calibri" w:hAnsi="Calibri"/>
               </w:rPr>
             </w:pPr>
             <w:r>
               <w:rPr>
-                <w:rFonts w:eastAsia="Calibri" w:cs=""/>
-                <w:kern w:val="0"/>
-                <w:sz w:val="22"/>
-                <w:szCs w:val="22"/>
-                <w:lang w:val="it-IT" w:eastAsia="en-US" w:bidi="ar-SA"/>
+                <w:rFonts w:eastAsia="Calibri"/>
               </w:rPr>
               <w:t>3840</w:t>
             </w:r>
@@ -863,29 +624,17 @@
         <w:tc>
           <w:tcPr>
             <w:tcW w:w="1843" w:type="dxa"/>
-            <w:tcBorders/>
           </w:tcPr>
           <w:p>
             <w:pPr>
-              <w:pStyle w:val="Normal"/>
-              <w:widowControl/>
-              <w:spacing w:lineRule="auto" w:line="240" w:before="0" w:after="0"/>
-              <w:jc w:val="left"/>
-              <w:rPr>
-                <w:rFonts w:ascii="Calibri" w:hAnsi="Calibri" w:eastAsia="Calibri" w:cs=""/>
-                <w:kern w:val="0"/>
-                <w:sz w:val="22"/>
-                <w:szCs w:val="22"/>
-                <w:lang w:val="it-IT" w:eastAsia="en-US" w:bidi="ar-SA"/>
+              <w:spacing w:after="0" w:line="240" w:lineRule="auto"/>
+              <w:rPr>
+                <w:rFonts w:ascii="Calibri" w:eastAsia="Calibri" w:hAnsi="Calibri"/>
               </w:rPr>
             </w:pPr>
             <w:r>
               <w:rPr>
-                <w:rFonts w:eastAsia="Calibri" w:cs=""/>
-                <w:kern w:val="0"/>
-                <w:sz w:val="22"/>
-                <w:szCs w:val="22"/>
-                <w:lang w:val="it-IT" w:eastAsia="en-US" w:bidi="ar-SA"/>
+                <w:rFonts w:eastAsia="Calibri"/>
               </w:rPr>
               <w:t>11316</w:t>
             </w:r>
@@ -894,29 +643,17 @@
         <w:tc>
           <w:tcPr>
             <w:tcW w:w="2692" w:type="dxa"/>
-            <w:tcBorders/>
           </w:tcPr>
           <w:p>
             <w:pPr>
-              <w:pStyle w:val="Normal"/>
-              <w:widowControl/>
-              <w:spacing w:lineRule="auto" w:line="240" w:before="0" w:after="0"/>
-              <w:jc w:val="left"/>
-              <w:rPr>
-                <w:rFonts w:ascii="Calibri" w:hAnsi="Calibri" w:eastAsia="Calibri" w:cs=""/>
-                <w:kern w:val="0"/>
-                <w:sz w:val="22"/>
-                <w:szCs w:val="22"/>
-                <w:lang w:val="it-IT" w:eastAsia="en-US" w:bidi="ar-SA"/>
+              <w:spacing w:after="0" w:line="240" w:lineRule="auto"/>
+              <w:rPr>
+                <w:rFonts w:ascii="Calibri" w:eastAsia="Calibri" w:hAnsi="Calibri"/>
               </w:rPr>
             </w:pPr>
             <w:r>
               <w:rPr>
-                <w:rFonts w:eastAsia="Calibri" w:cs=""/>
-                <w:kern w:val="0"/>
-                <w:sz w:val="22"/>
-                <w:szCs w:val="22"/>
-                <w:lang w:val="it-IT" w:eastAsia="en-US" w:bidi="ar-SA"/>
+                <w:rFonts w:eastAsia="Calibri"/>
               </w:rPr>
               <w:t>270</w:t>
             </w:r>
@@ -924,45 +661,36 @@
         </w:tc>
       </w:tr>
     </w:tbl>
+    <w:p/>
     <w:p>
       <w:pPr>
-        <w:pStyle w:val="Normal"/>
-        <w:rPr/>
-      </w:pPr>
-      <w:r>
-        <w:rPr/>
+        <w:rPr>
+          <w:b/>
+          <w:bCs/>
+          <w:sz w:val="20"/>
+          <w:szCs w:val="20"/>
+          <w:lang w:val="en-US"/>
+        </w:rPr>
+      </w:pPr>
+      <w:r>
+        <w:rPr>
+          <w:b/>
+          <w:bCs/>
+          <w:sz w:val="20"/>
+          <w:szCs w:val="20"/>
+          <w:lang w:val="en-US"/>
+        </w:rPr>
+        <w:t>General hints:</w:t>
       </w:r>
     </w:p>
     <w:p>
       <w:pPr>
-        <w:pStyle w:val="Normal"/>
-        <w:rPr>
-          <w:b/>
-          <w:bCs/>
-          <w:sz w:val="20"/>
-          <w:szCs w:val="20"/>
-          <w:lang w:val="en-US"/>
-        </w:rPr>
-      </w:pPr>
-      <w:r>
-        <w:rPr>
-          <w:b/>
-          <w:bCs/>
-          <w:sz w:val="20"/>
-          <w:szCs w:val="20"/>
-          <w:lang w:val="en-US"/>
-        </w:rPr>
-        <w:t>General hints:</w:t>
-      </w:r>
-    </w:p>
-    <w:p>
-      <w:pPr>
-        <w:pStyle w:val="ListParagraph"/>
+        <w:pStyle w:val="Paragrafoelenco"/>
         <w:numPr>
           <w:ilvl w:val="0"/>
           <w:numId w:val="1"/>
         </w:numPr>
-        <w:ind w:hanging="284" w:left="284"/>
+        <w:ind w:left="284" w:hanging="284"/>
         <w:rPr>
           <w:sz w:val="20"/>
           <w:szCs w:val="20"/>
@@ -980,12 +708,12 @@
     </w:p>
     <w:p>
       <w:pPr>
-        <w:pStyle w:val="ListParagraph"/>
+        <w:pStyle w:val="Paragrafoelenco"/>
         <w:numPr>
           <w:ilvl w:val="0"/>
           <w:numId w:val="1"/>
         </w:numPr>
-        <w:ind w:hanging="284" w:left="284"/>
+        <w:ind w:left="284" w:hanging="284"/>
         <w:rPr>
           <w:sz w:val="20"/>
           <w:szCs w:val="20"/>
@@ -1003,12 +731,12 @@
     </w:p>
     <w:p>
       <w:pPr>
-        <w:pStyle w:val="ListParagraph"/>
+        <w:pStyle w:val="Paragrafoelenco"/>
         <w:numPr>
           <w:ilvl w:val="0"/>
           <w:numId w:val="1"/>
         </w:numPr>
-        <w:ind w:hanging="284" w:left="284"/>
+        <w:ind w:left="284" w:hanging="284"/>
         <w:rPr>
           <w:sz w:val="20"/>
           <w:szCs w:val="20"/>
@@ -1026,7 +754,6 @@
     </w:p>
     <w:p>
       <w:pPr>
-        <w:pStyle w:val="Normal"/>
         <w:rPr>
           <w:b/>
           <w:bCs/>
@@ -1035,7 +762,9 @@
           <w:lang w:val="en-US"/>
         </w:rPr>
       </w:pPr>
-      <w:r>
+    </w:p>
+    <w:p>
+      <w:pPr>
         <w:rPr>
           <w:b/>
           <w:bCs/>
@@ -1043,140 +772,247 @@
           <w:szCs w:val="20"/>
           <w:lang w:val="en-US"/>
         </w:rPr>
+      </w:pPr>
+      <w:r>
+        <w:rPr>
+          <w:b/>
+          <w:bCs/>
+          <w:sz w:val="20"/>
+          <w:szCs w:val="20"/>
+          <w:lang w:val="en-US"/>
+        </w:rPr>
+        <w:t xml:space="preserve">PART 2: </w:t>
+      </w:r>
+      <w:r>
+        <w:rPr>
+          <w:sz w:val="20"/>
+          <w:szCs w:val="20"/>
+          <w:lang w:val="en-US"/>
+        </w:rPr>
+        <w:t xml:space="preserve">Describe the program G45GEN.java or G45GEN.py that you have implemented for point 5 of the specifications. Include a brief high-level description of your program and the constraints, if any, on the input parameters (e.g., the minimum number of points </w:t>
+      </w:r>
+      <w:r>
+        <w:rPr>
+          <w:i/>
+          <w:iCs/>
+          <w:sz w:val="20"/>
+          <w:szCs w:val="20"/>
+          <w:lang w:val="en-US"/>
+        </w:rPr>
+        <w:t>N</w:t>
+      </w:r>
+      <w:r>
+        <w:rPr>
+          <w:sz w:val="20"/>
+          <w:szCs w:val="20"/>
+          <w:lang w:val="en-US"/>
+        </w:rPr>
+        <w:t>).</w:t>
       </w:r>
     </w:p>
     <w:p>
       <w:pPr>
-        <w:pStyle w:val="Normal"/>
-        <w:rPr>
-          <w:b/>
-          <w:bCs/>
-          <w:sz w:val="20"/>
-          <w:szCs w:val="20"/>
-          <w:lang w:val="en-US"/>
-        </w:rPr>
-      </w:pPr>
-      <w:r>
-        <w:rPr>
-          <w:b/>
-          <w:bCs/>
-          <w:sz w:val="20"/>
-          <w:szCs w:val="20"/>
-          <w:lang w:val="en-US"/>
-        </w:rPr>
-        <w:t xml:space="preserve">PART 2: </w:t>
-      </w:r>
-      <w:r>
-        <w:rPr>
-          <w:sz w:val="20"/>
-          <w:szCs w:val="20"/>
-          <w:lang w:val="en-US"/>
-        </w:rPr>
-        <w:t>Describe the program G</w:t>
-      </w:r>
-      <w:r>
-        <w:rPr>
-          <w:sz w:val="20"/>
-          <w:szCs w:val="20"/>
-          <w:lang w:val="en-US"/>
-        </w:rPr>
-        <w:t>45G</w:t>
-      </w:r>
-      <w:r>
-        <w:rPr>
-          <w:sz w:val="20"/>
-          <w:szCs w:val="20"/>
-          <w:lang w:val="en-US"/>
-        </w:rPr>
-        <w:t>EN.java or G</w:t>
-      </w:r>
-      <w:r>
-        <w:rPr>
-          <w:sz w:val="20"/>
-          <w:szCs w:val="20"/>
-          <w:lang w:val="en-US"/>
-        </w:rPr>
-        <w:t>45</w:t>
-      </w:r>
-      <w:r>
-        <w:rPr>
-          <w:sz w:val="20"/>
-          <w:szCs w:val="20"/>
-          <w:lang w:val="en-US"/>
-        </w:rPr>
-        <w:t xml:space="preserve">GEN.py that you have implemented for point 5 of the specifications. Include a brief high-level description of your program and the constraints, if any, on the input parameters (e.g., the minimum number of points </w:t>
-      </w:r>
-      <w:r>
-        <w:rPr>
-          <w:i/>
-          <w:iCs/>
-          <w:sz w:val="20"/>
-          <w:szCs w:val="20"/>
-          <w:lang w:val="en-US"/>
-        </w:rPr>
-        <w:t>N</w:t>
-      </w:r>
-      <w:r>
-        <w:rPr>
-          <w:sz w:val="20"/>
-          <w:szCs w:val="20"/>
-          <w:lang w:val="en-US"/>
-        </w:rPr>
-        <w:t>).</w:t>
+        <w:rPr>
+          <w:lang w:val="en-US"/>
+        </w:rPr>
+      </w:pPr>
+      <w:r>
+        <w:rPr>
+          <w:lang w:val="en-US"/>
+        </w:rPr>
+        <w:t>The G45GEN.py file is a simple generator for obtaining a 4x improvement over the standard Lloyd’s algorithm (</w:t>
+      </w:r>
+      <w:r>
+        <w:rPr>
+          <w:lang w:val="en-US"/>
+        </w:rPr>
+        <w:t>if</w:t>
+      </w:r>
+      <w:r>
+        <w:rPr>
+          <w:lang w:val="en-US"/>
+        </w:rPr>
+        <w:t xml:space="preserve"> both clusterings find the optimal </w:t>
+      </w:r>
+      <w:r>
+        <w:rPr>
+          <w:lang w:val="en-US"/>
+        </w:rPr>
+        <w:t>minimum</w:t>
+      </w:r>
+      <w:r>
+        <w:rPr>
+          <w:lang w:val="en-US"/>
+        </w:rPr>
+        <w:t>)</w:t>
+      </w:r>
+      <w:r>
+        <w:rPr>
+          <w:lang w:val="en-US"/>
+        </w:rPr>
+        <w:t>.</w:t>
       </w:r>
     </w:p>
     <w:p>
       <w:pPr>
-        <w:pStyle w:val="Normal"/>
-        <w:rPr>
-          <w:b/>
-          <w:bCs/>
-          <w:sz w:val="20"/>
-          <w:szCs w:val="20"/>
-          <w:lang w:val="en-US"/>
-        </w:rPr>
-      </w:pPr>
-      <w:r>
-        <w:rPr>
-          <w:b/>
-          <w:bCs/>
-          <w:sz w:val="20"/>
-          <w:szCs w:val="20"/>
-          <w:lang w:val="en-US"/>
-        </w:rPr>
+        <w:rPr>
+          <w:lang w:val="en-US"/>
+        </w:rPr>
+      </w:pPr>
+      <w:r>
+        <w:rPr>
+          <w:lang w:val="en-US"/>
+        </w:rPr>
+        <w:t>The only point of group B is placed in the origin. Group B has a single point to create the maximum imbalance possible between the two algorithms.</w:t>
       </w:r>
     </w:p>
     <w:p>
       <w:pPr>
-        <w:pStyle w:val="ListParagraph"/>
-        <w:spacing w:before="0" w:after="160"/>
-        <w:contextualSpacing/>
-        <w:rPr>
-          <w:lang w:val="en-US"/>
-        </w:rPr>
-      </w:pPr>
-      <w:r>
-        <w:rPr>
-          <w:lang w:val="en-US"/>
-        </w:rPr>
+        <w:rPr>
+          <w:lang w:val="en-US"/>
+        </w:rPr>
+      </w:pPr>
+      <w:r>
+        <w:rPr>
+          <w:lang w:val="en-US"/>
+        </w:rPr>
+        <w:t>Then K-1 points of group A (the group of these points doesn’t really matter) are evenly placed on the circumference of radius N^2. This ensures that in the optimal clustering a center must be placed on each of the points, leaving only one center for the rest. (Maybe a radius of N^2 is a bit overkill, but just to be sure).</w:t>
+      </w:r>
+    </w:p>
+    <w:p>
+      <w:pPr>
+        <w:rPr>
+          <w:lang w:val="en-US"/>
+        </w:rPr>
+      </w:pPr>
+      <w:r>
+        <w:rPr>
+          <w:lang w:val="en-US"/>
+        </w:rPr>
+        <w:t xml:space="preserve">Finally, N-K points of group A are all placed at coordinates (0,1). The standard algorithm will try to put the last center closer to </w:t>
+      </w:r>
+      <w:r>
+        <w:rPr>
+          <w:lang w:val="en-US"/>
+        </w:rPr>
+        <w:t xml:space="preserve">the points at (0,1) (assuming there are more than one). As N gets larger, we can imagine the center to be placed exactly at (0,1). </w:t>
+      </w:r>
+      <w:r>
+        <w:rPr>
+          <w:lang w:val="en-US"/>
+        </w:rPr>
+        <w:t xml:space="preserve"> </w:t>
+      </w:r>
+      <w:r>
+        <w:rPr>
+          <w:lang w:val="en-US"/>
+        </w:rPr>
+        <w:t xml:space="preserve">The fair one instead recognizes that the origin point counts as much as the others combined, being the only one of group B, and will put the last center on position (0,1/2). </w:t>
+      </w:r>
+    </w:p>
+    <w:p>
+      <w:pPr>
+        <w:rPr>
+          <w:lang w:val="en-US"/>
+        </w:rPr>
+      </w:pPr>
+      <w:r>
+        <w:rPr>
+          <w:lang w:val="en-US"/>
+        </w:rPr>
+        <w:t>So,</w:t>
+      </w:r>
+      <w:r>
+        <w:rPr>
+          <w:lang w:val="en-US"/>
+        </w:rPr>
+        <w:t xml:space="preserve"> the fair objective for standard clustering will be 1 (distance between (0,0) and (0,1) squared), whilst the fair objective for fair clustering will be 0.25 (</w:t>
+      </w:r>
+      <w:r>
+        <w:rPr>
+          <w:lang w:val="en-US"/>
+        </w:rPr>
+        <w:t>distance between (0,0) and (0,1</w:t>
+      </w:r>
+      <w:r>
+        <w:rPr>
+          <w:lang w:val="en-US"/>
+        </w:rPr>
+        <w:t>/2</w:t>
+      </w:r>
+      <w:r>
+        <w:rPr>
+          <w:lang w:val="en-US"/>
+        </w:rPr>
+        <w:t>) squared)</w:t>
+      </w:r>
+      <w:r>
+        <w:rPr>
+          <w:lang w:val="en-US"/>
+        </w:rPr>
+        <w:t>.</w:t>
+      </w:r>
+    </w:p>
+    <w:p>
+      <w:pPr>
+        <w:rPr>
+          <w:lang w:val="en-US"/>
+        </w:rPr>
+      </w:pPr>
+      <w:r>
+        <w:rPr>
+          <w:lang w:val="en-US"/>
+        </w:rPr>
+        <w:t xml:space="preserve">We suggest N to be at least </w:t>
+      </w:r>
+      <w:r>
+        <w:rPr>
+          <w:lang w:val="en-US"/>
+        </w:rPr>
+        <w:t>100*</w:t>
+      </w:r>
+      <w:r>
+        <w:rPr>
+          <w:lang w:val="en-US"/>
+        </w:rPr>
+        <w:t>K</w:t>
+      </w:r>
+      <w:r>
+        <w:rPr>
+          <w:lang w:val="en-US"/>
+        </w:rPr>
+        <w:t xml:space="preserve"> </w:t>
+      </w:r>
+      <w:r>
+        <w:rPr>
+          <w:lang w:val="en-US"/>
+        </w:rPr>
+        <w:t>to s</w:t>
+      </w:r>
+      <w:r>
+        <w:rPr>
+          <w:lang w:val="en-US"/>
+        </w:rPr>
+        <w:t>tart seeing a convergence to the previous argument.</w:t>
       </w:r>
     </w:p>
     <w:sectPr>
-      <w:type w:val="nextPage"/>
       <w:pgSz w:w="11906" w:h="16838"/>
-      <w:pgMar w:left="1134" w:right="1134" w:gutter="0" w:header="0" w:top="1417" w:footer="0" w:bottom="1134"/>
-      <w:pgNumType w:fmt="decimal"/>
-      <w:formProt w:val="false"/>
-      <w:textDirection w:val="lrTb"/>
-      <w:docGrid w:type="default" w:linePitch="360" w:charSpace="4096"/>
+      <w:pgMar w:top="1417" w:right="1134" w:bottom="1134" w:left="1134" w:header="0" w:footer="0" w:gutter="0"/>
+      <w:cols w:space="720"/>
+      <w:formProt w:val="0"/>
+      <w:docGrid w:linePitch="360" w:charSpace="4096"/>
     </w:sectPr>
   </w:body>
 </w:document>
 </file>
 
 <file path=word/numbering.xml><?xml version="1.0" encoding="utf-8"?>
-<w:numbering xmlns:w="http://schemas.openxmlformats.org/wordprocessingml/2006/main" xmlns:o="urn:schemas-microsoft-com:office:office" xmlns:r="http://schemas.openxmlformats.org/officeDocument/2006/relationships" xmlns:v="urn:schemas-microsoft-com:vml" xmlns:mc="http://schemas.openxmlformats.org/markup-compatibility/2006" xmlns:w14="http://schemas.microsoft.com/office/word/2010/wordml" mc:Ignorable="w14">
-  <w:abstractNum w:abstractNumId="1">
+<w:numbering xmlns:wpc="http://schemas.microsoft.com/office/word/2010/wordprocessingCanvas" xmlns:cx="http://schemas.microsoft.com/office/drawing/2014/chartex" xmlns:cx1="http://schemas.microsoft.com/office/drawing/2015/9/8/chartex" xmlns:cx2="http://schemas.microsoft.com/office/drawing/2015/10/21/chartex" xmlns:cx3="http://schemas.microsoft.com/office/drawing/2016/5/9/chartex" xmlns:cx4="http://schemas.microsoft.com/office/drawing/2016/5/10/chartex" xmlns:cx5="http://schemas.microsoft.com/office/drawing/2016/5/11/chartex" xmlns:cx6="http://schemas.microsoft.com/office/drawing/2016/5/12/chartex" xmlns:cx7="http://schemas.microsoft.com/office/drawing/2016/5/13/chartex" xmlns:cx8="http://schemas.microsoft.com/office/drawing/2016/5/14/chartex" xmlns:mc="http://schemas.openxmlformats.org/markup-compatibility/2006" xmlns:aink="http://schemas.microsoft.com/office/drawing/2016/ink" xmlns:am3d="http://schemas.microsoft.com/office/drawing/2017/model3d" xmlns:o="urn:schemas-microsoft-com:office:office" xmlns:oel="http://schemas.microsoft.com/office/2019/extlst" xmlns:r="http://schemas.openxmlformats.org/officeDocument/2006/relationships" xmlns:m="http://schemas.openxmlformats.org/officeDocument/2006/math" xmlns:v="urn:schemas-microsoft-com:vml" xmlns:wp14="http://schemas.microsoft.com/office/word/2010/wordprocessingDrawing" xmlns:wp="http://schemas.openxmlformats.org/drawingml/2006/wordprocessingDrawing" xmlns:w10="urn:schemas-microsoft-com:office:word" xmlns:w="http://schemas.openxmlformats.org/wordprocessingml/2006/main" xmlns:w14="http://schemas.microsoft.com/office/word/2010/wordml" xmlns:w15="http://schemas.microsoft.com/office/word/2012/wordml" xmlns:w16cex="http://schemas.microsoft.com/office/word/2018/wordml/cex" xmlns:w16cid="http://schemas.microsoft.com/office/word/2016/wordml/cid" xmlns:w16="http://schemas.microsoft.com/office/word/2018/wordml" xmlns:w16du="http://schemas.microsoft.com/office/word/2023/wordml/word16du" xmlns:w16sdtdh="http://schemas.microsoft.com/office/word/2020/wordml/sdtdatahash" xmlns:w16sdtfl="http://schemas.microsoft.com/office/word/2024/wordml/sdtformatlock" xmlns:w16se="http://schemas.microsoft.com/office/word/2015/wordml/symex" xmlns:wpg="http://schemas.microsoft.com/office/word/2010/wordprocessingGroup" xmlns:wpi="http://schemas.microsoft.com/office/word/2010/wordprocessingInk" xmlns:wne="http://schemas.microsoft.com/office/word/2006/wordml" xmlns:wps="http://schemas.microsoft.com/office/word/2010/wordprocessingShape" mc:Ignorable="w14 w15 w16se w16cid w16 w16cex w16sdtdh w16sdtfl w16du wp14">
+  <w:abstractNum w:abstractNumId="0" w15:restartNumberingAfterBreak="0">
+    <w:nsid w:val="2D5965CD"/>
+    <w:multiLevelType w:val="multilevel"/>
+    <w:tmpl w:val="7902AE24"/>
     <w:lvl w:ilvl="0">
       <w:start w:val="1"/>
       <w:numFmt w:val="bullet"/>
@@ -1313,7 +1149,10 @@
       </w:rPr>
     </w:lvl>
   </w:abstractNum>
-  <w:abstractNum w:abstractNumId="2">
+  <w:abstractNum w:abstractNumId="1" w15:restartNumberingAfterBreak="0">
+    <w:nsid w:val="7B5F4406"/>
+    <w:multiLevelType w:val="multilevel"/>
+    <w:tmpl w:val="B8985578"/>
     <w:lvl w:ilvl="0">
       <w:start w:val="1"/>
       <w:numFmt w:val="none"/>
@@ -1324,7 +1163,7 @@
         <w:tabs>
           <w:tab w:val="num" w:pos="0"/>
         </w:tabs>
-        <w:ind w:left="0" w:hanging="0"/>
+        <w:ind w:left="0" w:firstLine="0"/>
       </w:pPr>
     </w:lvl>
     <w:lvl w:ilvl="1">
@@ -1337,7 +1176,7 @@
         <w:tabs>
           <w:tab w:val="num" w:pos="0"/>
         </w:tabs>
-        <w:ind w:left="0" w:hanging="0"/>
+        <w:ind w:left="0" w:firstLine="0"/>
       </w:pPr>
     </w:lvl>
     <w:lvl w:ilvl="2">
@@ -1350,7 +1189,7 @@
         <w:tabs>
           <w:tab w:val="num" w:pos="0"/>
         </w:tabs>
-        <w:ind w:left="0" w:hanging="0"/>
+        <w:ind w:left="0" w:firstLine="0"/>
       </w:pPr>
     </w:lvl>
     <w:lvl w:ilvl="3">
@@ -1363,7 +1202,7 @@
         <w:tabs>
           <w:tab w:val="num" w:pos="0"/>
         </w:tabs>
-        <w:ind w:left="0" w:hanging="0"/>
+        <w:ind w:left="0" w:firstLine="0"/>
       </w:pPr>
     </w:lvl>
     <w:lvl w:ilvl="4">
@@ -1376,7 +1215,7 @@
         <w:tabs>
           <w:tab w:val="num" w:pos="0"/>
         </w:tabs>
-        <w:ind w:left="0" w:hanging="0"/>
+        <w:ind w:left="0" w:firstLine="0"/>
       </w:pPr>
     </w:lvl>
     <w:lvl w:ilvl="5">
@@ -1389,7 +1228,7 @@
         <w:tabs>
           <w:tab w:val="num" w:pos="0"/>
         </w:tabs>
-        <w:ind w:left="0" w:hanging="0"/>
+        <w:ind w:left="0" w:firstLine="0"/>
       </w:pPr>
     </w:lvl>
     <w:lvl w:ilvl="6">
@@ -1402,7 +1241,7 @@
         <w:tabs>
           <w:tab w:val="num" w:pos="0"/>
         </w:tabs>
-        <w:ind w:left="0" w:hanging="0"/>
+        <w:ind w:left="0" w:firstLine="0"/>
       </w:pPr>
     </w:lvl>
     <w:lvl w:ilvl="7">
@@ -1415,7 +1254,7 @@
         <w:tabs>
           <w:tab w:val="num" w:pos="0"/>
         </w:tabs>
-        <w:ind w:left="0" w:hanging="0"/>
+        <w:ind w:left="0" w:firstLine="0"/>
       </w:pPr>
     </w:lvl>
     <w:lvl w:ilvl="8">
@@ -1428,25 +1267,25 @@
         <w:tabs>
           <w:tab w:val="num" w:pos="0"/>
         </w:tabs>
-        <w:ind w:left="0" w:hanging="0"/>
+        <w:ind w:left="0" w:firstLine="0"/>
       </w:pPr>
     </w:lvl>
   </w:abstractNum>
-  <w:num w:numId="1">
+  <w:num w:numId="1" w16cid:durableId="1547912501">
+    <w:abstractNumId w:val="0"/>
+  </w:num>
+  <w:num w:numId="2" w16cid:durableId="1607032452">
     <w:abstractNumId w:val="1"/>
-  </w:num>
-  <w:num w:numId="2">
-    <w:abstractNumId w:val="2"/>
   </w:num>
 </w:numbering>
 </file>
 
 <file path=word/styles.xml><?xml version="1.0" encoding="utf-8"?>
-<w:styles xmlns:w="http://schemas.openxmlformats.org/wordprocessingml/2006/main" xmlns:w14="http://schemas.microsoft.com/office/word/2010/wordml" xmlns:mc="http://schemas.openxmlformats.org/markup-compatibility/2006" mc:Ignorable="w14">
+<w:styles xmlns:mc="http://schemas.openxmlformats.org/markup-compatibility/2006" xmlns:r="http://schemas.openxmlformats.org/officeDocument/2006/relationships" xmlns:w="http://schemas.openxmlformats.org/wordprocessingml/2006/main" xmlns:w14="http://schemas.microsoft.com/office/word/2010/wordml" xmlns:w15="http://schemas.microsoft.com/office/word/2012/wordml" xmlns:w16cex="http://schemas.microsoft.com/office/word/2018/wordml/cex" xmlns:w16cid="http://schemas.microsoft.com/office/word/2016/wordml/cid" xmlns:w16="http://schemas.microsoft.com/office/word/2018/wordml" xmlns:w16du="http://schemas.microsoft.com/office/word/2023/wordml/word16du" xmlns:w16sdtdh="http://schemas.microsoft.com/office/word/2020/wordml/sdtdatahash" xmlns:w16sdtfl="http://schemas.microsoft.com/office/word/2024/wordml/sdtformatlock" xmlns:w16se="http://schemas.microsoft.com/office/word/2015/wordml/symex" mc:Ignorable="w14 w15 w16se w16cid w16 w16cex w16sdtdh w16sdtfl w16du">
   <w:docDefaults>
     <w:rPrDefault>
       <w:rPr>
-        <w:rFonts w:ascii="Calibri" w:hAnsi="Calibri" w:eastAsia="Calibri" w:cs="" w:asciiTheme="minorHAnsi" w:cstheme="minorBidi" w:eastAsiaTheme="minorHAnsi" w:hAnsiTheme="minorHAnsi"/>
+        <w:rFonts w:asciiTheme="minorHAnsi" w:eastAsiaTheme="minorHAnsi" w:hAnsiTheme="minorHAnsi" w:cstheme="minorBidi"/>
         <w:sz w:val="22"/>
         <w:szCs w:val="22"/>
         <w:lang w:val="it-IT" w:eastAsia="en-US" w:bidi="ar-SA"/>
@@ -1454,21 +1293,21 @@
     </w:rPrDefault>
     <w:pPrDefault>
       <w:pPr>
-        <w:suppressAutoHyphens w:val="true"/>
+        <w:suppressAutoHyphens/>
       </w:pPr>
     </w:pPrDefault>
   </w:docDefaults>
   <w:latentStyles w:defLockedState="0" w:defUIPriority="99" w:defSemiHidden="0" w:defUnhideWhenUsed="0" w:defQFormat="0" w:count="376">
     <w:lsdException w:name="Normal" w:uiPriority="0" w:qFormat="1"/>
     <w:lsdException w:name="heading 1" w:uiPriority="9" w:qFormat="1"/>
-    <w:lsdException w:name="heading 2" w:uiPriority="9" w:semiHidden="1" w:unhideWhenUsed="1" w:qFormat="1"/>
-    <w:lsdException w:name="heading 3" w:uiPriority="9" w:semiHidden="1" w:unhideWhenUsed="1" w:qFormat="1"/>
-    <w:lsdException w:name="heading 4" w:uiPriority="9" w:semiHidden="1" w:unhideWhenUsed="1" w:qFormat="1"/>
-    <w:lsdException w:name="heading 5" w:uiPriority="9" w:semiHidden="1" w:unhideWhenUsed="1" w:qFormat="1"/>
-    <w:lsdException w:name="heading 6" w:uiPriority="9" w:semiHidden="1" w:unhideWhenUsed="1" w:qFormat="1"/>
-    <w:lsdException w:name="heading 7" w:uiPriority="9" w:semiHidden="1" w:unhideWhenUsed="1" w:qFormat="1"/>
-    <w:lsdException w:name="heading 8" w:uiPriority="9" w:semiHidden="1" w:unhideWhenUsed="1" w:qFormat="1"/>
-    <w:lsdException w:name="heading 9" w:uiPriority="9" w:semiHidden="1" w:unhideWhenUsed="1" w:qFormat="1"/>
+    <w:lsdException w:name="heading 2" w:semiHidden="1" w:uiPriority="9" w:unhideWhenUsed="1" w:qFormat="1"/>
+    <w:lsdException w:name="heading 3" w:semiHidden="1" w:uiPriority="9" w:unhideWhenUsed="1" w:qFormat="1"/>
+    <w:lsdException w:name="heading 4" w:semiHidden="1" w:uiPriority="9" w:unhideWhenUsed="1" w:qFormat="1"/>
+    <w:lsdException w:name="heading 5" w:semiHidden="1" w:uiPriority="9" w:unhideWhenUsed="1" w:qFormat="1"/>
+    <w:lsdException w:name="heading 6" w:semiHidden="1" w:uiPriority="9" w:unhideWhenUsed="1" w:qFormat="1"/>
+    <w:lsdException w:name="heading 7" w:semiHidden="1" w:uiPriority="9" w:unhideWhenUsed="1" w:qFormat="1"/>
+    <w:lsdException w:name="heading 8" w:semiHidden="1" w:uiPriority="9" w:unhideWhenUsed="1" w:qFormat="1"/>
+    <w:lsdException w:name="heading 9" w:semiHidden="1" w:uiPriority="9" w:unhideWhenUsed="1" w:qFormat="1"/>
     <w:lsdException w:name="index 1" w:semiHidden="1" w:unhideWhenUsed="1"/>
     <w:lsdException w:name="index 2" w:semiHidden="1" w:unhideWhenUsed="1"/>
     <w:lsdException w:name="index 3" w:semiHidden="1" w:unhideWhenUsed="1"/>
@@ -1478,22 +1317,22 @@
     <w:lsdException w:name="index 7" w:semiHidden="1" w:unhideWhenUsed="1"/>
     <w:lsdException w:name="index 8" w:semiHidden="1" w:unhideWhenUsed="1"/>
     <w:lsdException w:name="index 9" w:semiHidden="1" w:unhideWhenUsed="1"/>
-    <w:lsdException w:name="toc 1" w:uiPriority="39" w:semiHidden="1" w:unhideWhenUsed="1"/>
-    <w:lsdException w:name="toc 2" w:uiPriority="39" w:semiHidden="1" w:unhideWhenUsed="1"/>
-    <w:lsdException w:name="toc 3" w:uiPriority="39" w:semiHidden="1" w:unhideWhenUsed="1"/>
-    <w:lsdException w:name="toc 4" w:uiPriority="39" w:semiHidden="1" w:unhideWhenUsed="1"/>
-    <w:lsdException w:name="toc 5" w:uiPriority="39" w:semiHidden="1" w:unhideWhenUsed="1"/>
-    <w:lsdException w:name="toc 6" w:uiPriority="39" w:semiHidden="1" w:unhideWhenUsed="1"/>
-    <w:lsdException w:name="toc 7" w:uiPriority="39" w:semiHidden="1" w:unhideWhenUsed="1"/>
-    <w:lsdException w:name="toc 8" w:uiPriority="39" w:semiHidden="1" w:unhideWhenUsed="1"/>
-    <w:lsdException w:name="toc 9" w:uiPriority="39" w:semiHidden="1" w:unhideWhenUsed="1"/>
+    <w:lsdException w:name="toc 1" w:semiHidden="1" w:uiPriority="39" w:unhideWhenUsed="1"/>
+    <w:lsdException w:name="toc 2" w:semiHidden="1" w:uiPriority="39" w:unhideWhenUsed="1"/>
+    <w:lsdException w:name="toc 3" w:semiHidden="1" w:uiPriority="39" w:unhideWhenUsed="1"/>
+    <w:lsdException w:name="toc 4" w:semiHidden="1" w:uiPriority="39" w:unhideWhenUsed="1"/>
+    <w:lsdException w:name="toc 5" w:semiHidden="1" w:uiPriority="39" w:unhideWhenUsed="1"/>
+    <w:lsdException w:name="toc 6" w:semiHidden="1" w:uiPriority="39" w:unhideWhenUsed="1"/>
+    <w:lsdException w:name="toc 7" w:semiHidden="1" w:uiPriority="39" w:unhideWhenUsed="1"/>
+    <w:lsdException w:name="toc 8" w:semiHidden="1" w:uiPriority="39" w:unhideWhenUsed="1"/>
+    <w:lsdException w:name="toc 9" w:semiHidden="1" w:uiPriority="39" w:unhideWhenUsed="1"/>
     <w:lsdException w:name="Normal Indent" w:semiHidden="1" w:unhideWhenUsed="1"/>
     <w:lsdException w:name="footnote text" w:semiHidden="1" w:unhideWhenUsed="1"/>
     <w:lsdException w:name="annotation text" w:semiHidden="1" w:unhideWhenUsed="1"/>
     <w:lsdException w:name="header" w:semiHidden="1" w:unhideWhenUsed="1"/>
     <w:lsdException w:name="footer" w:semiHidden="1" w:unhideWhenUsed="1"/>
     <w:lsdException w:name="index heading" w:semiHidden="1" w:unhideWhenUsed="1"/>
-    <w:lsdException w:name="caption" w:uiPriority="35" w:semiHidden="1" w:unhideWhenUsed="1" w:qFormat="1"/>
+    <w:lsdException w:name="caption" w:semiHidden="1" w:uiPriority="35" w:unhideWhenUsed="1" w:qFormat="1"/>
     <w:lsdException w:name="table of figures" w:semiHidden="1" w:unhideWhenUsed="1"/>
     <w:lsdException w:name="envelope address" w:semiHidden="1" w:unhideWhenUsed="1"/>
     <w:lsdException w:name="envelope return" w:semiHidden="1" w:unhideWhenUsed="1"/>
@@ -1524,7 +1363,7 @@
     <w:lsdException w:name="Title" w:uiPriority="10" w:qFormat="1"/>
     <w:lsdException w:name="Closing" w:semiHidden="1" w:unhideWhenUsed="1"/>
     <w:lsdException w:name="Signature" w:semiHidden="1" w:unhideWhenUsed="1"/>
-    <w:lsdException w:name="Default Paragraph Font" w:uiPriority="1" w:semiHidden="1" w:unhideWhenUsed="1"/>
+    <w:lsdException w:name="Default Paragraph Font" w:semiHidden="1" w:uiPriority="1" w:unhideWhenUsed="1"/>
     <w:lsdException w:name="Body Text" w:semiHidden="1" w:unhideWhenUsed="1"/>
     <w:lsdException w:name="Body Text Indent" w:semiHidden="1" w:unhideWhenUsed="1"/>
     <w:lsdException w:name="List Continue" w:semiHidden="1" w:unhideWhenUsed="1"/>
@@ -1724,8 +1563,8 @@
     <w:lsdException w:name="Subtle Reference" w:uiPriority="31" w:qFormat="1"/>
     <w:lsdException w:name="Intense Reference" w:uiPriority="32" w:qFormat="1"/>
     <w:lsdException w:name="Book Title" w:uiPriority="33" w:qFormat="1"/>
-    <w:lsdException w:name="Bibliography" w:uiPriority="37" w:semiHidden="1" w:unhideWhenUsed="1"/>
-    <w:lsdException w:name="TOC Heading" w:uiPriority="39" w:semiHidden="1" w:unhideWhenUsed="1" w:qFormat="1"/>
+    <w:lsdException w:name="Bibliography" w:semiHidden="1" w:uiPriority="37" w:unhideWhenUsed="1"/>
+    <w:lsdException w:name="TOC Heading" w:semiHidden="1" w:uiPriority="39" w:unhideWhenUsed="1" w:qFormat="1"/>
     <w:lsdException w:name="Plain Table 1" w:uiPriority="41"/>
     <w:lsdException w:name="Plain Table 2" w:uiPriority="42"/>
     <w:lsdException w:name="Plain Table 3" w:uiPriority="43"/>
@@ -1836,80 +1675,86 @@
     <w:lsdException w:name="Unresolved Mention" w:semiHidden="1" w:unhideWhenUsed="1"/>
     <w:lsdException w:name="Smart Link" w:semiHidden="1" w:unhideWhenUsed="1"/>
   </w:latentStyles>
-  <w:style w:type="paragraph" w:styleId="Normal" w:default="1">
+  <w:style w:type="paragraph" w:default="1" w:styleId="Normale">
     <w:name w:val="Normal"/>
     <w:qFormat/>
     <w:pPr>
-      <w:widowControl/>
-      <w:bidi w:val="0"/>
-      <w:spacing w:lineRule="auto" w:line="259" w:before="0" w:after="160"/>
-      <w:jc w:val="left"/>
+      <w:spacing w:after="160" w:line="259" w:lineRule="auto"/>
     </w:pPr>
-    <w:rPr>
-      <w:rFonts w:ascii="Calibri" w:hAnsi="Calibri" w:eastAsia="Calibri" w:cs="" w:asciiTheme="minorHAnsi" w:cstheme="minorBidi" w:eastAsiaTheme="minorHAnsi" w:hAnsiTheme="minorHAnsi"/>
-      <w:color w:val="auto"/>
-      <w:kern w:val="0"/>
-      <w:sz w:val="22"/>
-      <w:szCs w:val="22"/>
-      <w:lang w:val="it-IT" w:eastAsia="en-US" w:bidi="ar-SA"/>
-    </w:rPr>
   </w:style>
-  <w:style w:type="character" w:styleId="DefaultParagraphFont" w:default="1">
+  <w:style w:type="character" w:default="1" w:styleId="Carpredefinitoparagrafo">
     <w:name w:val="Default Paragraph Font"/>
     <w:uiPriority w:val="1"/>
     <w:semiHidden/>
     <w:unhideWhenUsed/>
-    <w:qFormat/>
-    <w:rPr/>
   </w:style>
-  <w:style w:type="character" w:styleId="BalloonTextChar" w:customStyle="1">
-    <w:name w:val="Balloon Text Char"/>
-    <w:basedOn w:val="DefaultParagraphFont"/>
-    <w:link w:val="BalloonText"/>
+  <w:style w:type="table" w:default="1" w:styleId="Tabellanormale">
+    <w:name w:val="Normal Table"/>
+    <w:uiPriority w:val="99"/>
+    <w:semiHidden/>
+    <w:unhideWhenUsed/>
+    <w:tblPr>
+      <w:tblInd w:w="0" w:type="dxa"/>
+      <w:tblCellMar>
+        <w:top w:w="0" w:type="dxa"/>
+        <w:left w:w="108" w:type="dxa"/>
+        <w:bottom w:w="0" w:type="dxa"/>
+        <w:right w:w="108" w:type="dxa"/>
+      </w:tblCellMar>
+    </w:tblPr>
+  </w:style>
+  <w:style w:type="numbering" w:default="1" w:styleId="Nessunelenco">
+    <w:name w:val="No List"/>
+    <w:uiPriority w:val="99"/>
+    <w:semiHidden/>
+    <w:unhideWhenUsed/>
+  </w:style>
+  <w:style w:type="character" w:customStyle="1" w:styleId="TestofumettoCarattere">
+    <w:name w:val="Testo fumetto Carattere"/>
+    <w:basedOn w:val="Carpredefinitoparagrafo"/>
+    <w:link w:val="Testofumetto"/>
     <w:uiPriority w:val="99"/>
     <w:semiHidden/>
     <w:qFormat/>
-    <w:rsid w:val="00e94568"/>
+    <w:rsid w:val="00E94568"/>
     <w:rPr>
       <w:rFonts w:ascii="Segoe UI" w:hAnsi="Segoe UI" w:cs="Segoe UI"/>
       <w:sz w:val="18"/>
       <w:szCs w:val="18"/>
     </w:rPr>
   </w:style>
-  <w:style w:type="paragraph" w:styleId="Heading">
+  <w:style w:type="paragraph" w:customStyle="1" w:styleId="Heading">
     <w:name w:val="Heading"/>
-    <w:basedOn w:val="Normal"/>
-    <w:next w:val="BodyText"/>
+    <w:basedOn w:val="Normale"/>
+    <w:next w:val="Corpotesto"/>
     <w:qFormat/>
     <w:pPr>
-      <w:keepNext w:val="true"/>
+      <w:keepNext/>
       <w:spacing w:before="240" w:after="120"/>
     </w:pPr>
     <w:rPr>
-      <w:rFonts w:ascii="Liberation Sans" w:hAnsi="Liberation Sans" w:eastAsia="Microsoft YaHei" w:cs="Lucida Sans"/>
+      <w:rFonts w:ascii="Liberation Sans" w:eastAsia="Microsoft YaHei" w:hAnsi="Liberation Sans" w:cs="Lucida Sans"/>
       <w:sz w:val="28"/>
       <w:szCs w:val="28"/>
     </w:rPr>
   </w:style>
-  <w:style w:type="paragraph" w:styleId="BodyText">
+  <w:style w:type="paragraph" w:styleId="Corpotesto">
     <w:name w:val="Body Text"/>
-    <w:basedOn w:val="Normal"/>
+    <w:basedOn w:val="Normale"/>
     <w:pPr>
-      <w:spacing w:lineRule="auto" w:line="276" w:before="0" w:after="140"/>
+      <w:spacing w:after="140" w:line="276" w:lineRule="auto"/>
     </w:pPr>
-    <w:rPr/>
   </w:style>
-  <w:style w:type="paragraph" w:styleId="List">
+  <w:style w:type="paragraph" w:styleId="Elenco">
     <w:name w:val="List"/>
-    <w:basedOn w:val="BodyText"/>
-    <w:pPr/>
+    <w:basedOn w:val="Corpotesto"/>
     <w:rPr>
       <w:rFonts w:cs="Lucida Sans"/>
     </w:rPr>
   </w:style>
-  <w:style w:type="paragraph" w:styleId="Caption">
+  <w:style w:type="paragraph" w:styleId="Didascalia">
     <w:name w:val="caption"/>
-    <w:basedOn w:val="Normal"/>
+    <w:basedOn w:val="Normale"/>
     <w:qFormat/>
     <w:pPr>
       <w:suppressLineNumbers/>
@@ -1923,9 +1768,9 @@
       <w:szCs w:val="24"/>
     </w:rPr>
   </w:style>
-  <w:style w:type="paragraph" w:styleId="Index">
+  <w:style w:type="paragraph" w:customStyle="1" w:styleId="Index">
     <w:name w:val="Index"/>
-    <w:basedOn w:val="Normal"/>
+    <w:basedOn w:val="Normale"/>
     <w:qFormat/>
     <w:pPr>
       <w:suppressLineNumbers/>
@@ -1934,30 +1779,28 @@
       <w:rFonts w:cs="Lucida Sans"/>
     </w:rPr>
   </w:style>
-  <w:style w:type="paragraph" w:styleId="ListParagraph">
+  <w:style w:type="paragraph" w:styleId="Paragrafoelenco">
     <w:name w:val="List Paragraph"/>
-    <w:basedOn w:val="Normal"/>
+    <w:basedOn w:val="Normale"/>
     <w:uiPriority w:val="34"/>
     <w:qFormat/>
-    <w:rsid w:val="002a5cac"/>
+    <w:rsid w:val="002A5CAC"/>
     <w:pPr>
-      <w:spacing w:before="0" w:after="160"/>
       <w:ind w:left="720"/>
       <w:contextualSpacing/>
     </w:pPr>
-    <w:rPr/>
   </w:style>
-  <w:style w:type="paragraph" w:styleId="BalloonText">
+  <w:style w:type="paragraph" w:styleId="Testofumetto">
     <w:name w:val="Balloon Text"/>
-    <w:basedOn w:val="Normal"/>
-    <w:link w:val="BalloonTextChar"/>
+    <w:basedOn w:val="Normale"/>
+    <w:link w:val="TestofumettoCarattere"/>
     <w:uiPriority w:val="99"/>
     <w:semiHidden/>
     <w:unhideWhenUsed/>
     <w:qFormat/>
-    <w:rsid w:val="00e94568"/>
+    <w:rsid w:val="00E94568"/>
     <w:pPr>
-      <w:spacing w:lineRule="auto" w:line="240" w:before="0" w:after="0"/>
+      <w:spacing w:after="0" w:line="240" w:lineRule="auto"/>
     </w:pPr>
     <w:rPr>
       <w:rFonts w:ascii="Segoe UI" w:hAnsi="Segoe UI" w:cs="Segoe UI"/>
@@ -1965,22 +1808,20 @@
       <w:szCs w:val="18"/>
     </w:rPr>
   </w:style>
-  <w:style w:type="paragraph" w:styleId="TableContents">
+  <w:style w:type="paragraph" w:customStyle="1" w:styleId="TableContents">
     <w:name w:val="Table Contents"/>
-    <w:basedOn w:val="Normal"/>
+    <w:basedOn w:val="Normale"/>
     <w:qFormat/>
     <w:pPr>
-      <w:widowControl w:val="false"/>
+      <w:widowControl w:val="0"/>
       <w:suppressLineNumbers/>
     </w:pPr>
-    <w:rPr/>
   </w:style>
-  <w:style w:type="paragraph" w:styleId="TableHeading">
+  <w:style w:type="paragraph" w:customStyle="1" w:styleId="TableHeading">
     <w:name w:val="Table Heading"/>
     <w:basedOn w:val="TableContents"/>
     <w:qFormat/>
     <w:pPr>
-      <w:suppressLineNumbers/>
       <w:jc w:val="center"/>
     </w:pPr>
     <w:rPr>
@@ -1988,43 +1829,19 @@
       <w:bCs/>
     </w:rPr>
   </w:style>
-  <w:style w:type="numbering" w:styleId="NoList" w:default="1">
-    <w:name w:val="No List"/>
-    <w:uiPriority w:val="99"/>
-    <w:semiHidden/>
-    <w:unhideWhenUsed/>
-    <w:qFormat/>
-  </w:style>
-  <w:style w:type="table" w:default="1" w:styleId="TableNormal">
-    <w:name w:val="Normal Table"/>
-    <w:uiPriority w:val="99"/>
-    <w:semiHidden/>
-    <w:unhideWhenUsed/>
-    <w:tblPr>
-      <w:tblCellMar>
-        <w:top w:w="0" w:type="dxa"/>
-        <w:left w:w="108" w:type="dxa"/>
-        <w:bottom w:w="0" w:type="dxa"/>
-        <w:right w:w="108" w:type="dxa"/>
-      </w:tblCellMar>
-    </w:tblPr>
-  </w:style>
-  <w:style w:type="table" w:styleId="TableGrid">
+  <w:style w:type="table" w:styleId="Grigliatabella">
     <w:name w:val="Table Grid"/>
-    <w:basedOn w:val="TableNormal"/>
+    <w:basedOn w:val="Tabellanormale"/>
     <w:uiPriority w:val="39"/>
-    <w:rsid w:val="006b790b"/>
-    <w:pPr>
-      <w:spacing w:after="0" w:line="240" w:lineRule="auto"/>
-    </w:pPr>
+    <w:rsid w:val="006B790B"/>
     <w:tblPr>
       <w:tblBorders>
-        <w:top w:val="single" w:color="auto" w:sz="4" w:space="0"/>
-        <w:left w:val="single" w:color="auto" w:sz="4" w:space="0"/>
-        <w:bottom w:val="single" w:color="auto" w:sz="4" w:space="0"/>
-        <w:right w:val="single" w:color="auto" w:sz="4" w:space="0"/>
-        <w:insideH w:val="single" w:color="auto" w:sz="4" w:space="0"/>
-        <w:insideV w:val="single" w:color="auto" w:sz="4" w:space="0"/>
+        <w:top w:val="single" w:sz="4" w:space="0" w:color="auto"/>
+        <w:left w:val="single" w:sz="4" w:space="0" w:color="auto"/>
+        <w:bottom w:val="single" w:sz="4" w:space="0" w:color="auto"/>
+        <w:right w:val="single" w:sz="4" w:space="0" w:color="auto"/>
+        <w:insideH w:val="single" w:sz="4" w:space="0" w:color="auto"/>
+        <w:insideV w:val="single" w:sz="4" w:space="0" w:color="auto"/>
       </w:tblBorders>
     </w:tblPr>
   </w:style>
@@ -2032,54 +1849,54 @@
 </file>
 
 <file path=word/theme/theme1.xml><?xml version="1.0" encoding="utf-8"?>
-<a:theme xmlns:a="http://schemas.openxmlformats.org/drawingml/2006/main" xmlns:r="http://schemas.openxmlformats.org/officeDocument/2006/relationships" name="Tema di Office">
+<a:theme xmlns:a="http://schemas.openxmlformats.org/drawingml/2006/main" name="Tema di Office">
   <a:themeElements>
     <a:clrScheme name="Office">
       <a:dk1>
         <a:srgbClr val="000000"/>
       </a:dk1>
       <a:lt1>
-        <a:srgbClr val="ffffff"/>
+        <a:srgbClr val="FFFFFF"/>
       </a:lt1>
       <a:dk2>
-        <a:srgbClr val="44546a"/>
+        <a:srgbClr val="44546A"/>
       </a:dk2>
       <a:lt2>
-        <a:srgbClr val="e7e6e6"/>
+        <a:srgbClr val="E7E6E6"/>
       </a:lt2>
       <a:accent1>
-        <a:srgbClr val="5b9bd5"/>
+        <a:srgbClr val="5B9BD5"/>
       </a:accent1>
       <a:accent2>
-        <a:srgbClr val="ed7d31"/>
+        <a:srgbClr val="ED7D31"/>
       </a:accent2>
       <a:accent3>
-        <a:srgbClr val="a5a5a5"/>
+        <a:srgbClr val="A5A5A5"/>
       </a:accent3>
       <a:accent4>
-        <a:srgbClr val="ffc000"/>
+        <a:srgbClr val="FFC000"/>
       </a:accent4>
       <a:accent5>
-        <a:srgbClr val="4472c4"/>
+        <a:srgbClr val="4472C4"/>
       </a:accent5>
       <a:accent6>
-        <a:srgbClr val="70ad47"/>
+        <a:srgbClr val="70AD47"/>
       </a:accent6>
       <a:hlink>
-        <a:srgbClr val="0563c1"/>
+        <a:srgbClr val="0563C1"/>
       </a:hlink>
       <a:folHlink>
-        <a:srgbClr val="954f72"/>
+        <a:srgbClr val="954F72"/>
       </a:folHlink>
     </a:clrScheme>
     <a:fontScheme name="Office">
       <a:majorFont>
-        <a:latin typeface="Calibri Light" panose="020F0302020204030204" pitchFamily="0" charset="1"/>
+        <a:latin typeface="Calibri Light" panose="020F0302020204030204"/>
         <a:ea typeface=""/>
         <a:cs typeface=""/>
       </a:majorFont>
       <a:minorFont>
-        <a:latin typeface="Calibri" panose="020F0502020204030204" pitchFamily="0" charset="1"/>
+        <a:latin typeface="Calibri" panose="020F0502020204030204"/>
         <a:ea typeface=""/>
         <a:cs typeface=""/>
       </a:minorFont>
@@ -2111,7 +1928,7 @@
             </a:gs>
           </a:gsLst>
           <a:lin ang="5400000" scaled="0"/>
-          <a:tileRect l="0" t="0" r="0" b="0"/>
+          <a:tileRect/>
         </a:gradFill>
         <a:gradFill>
           <a:gsLst>
@@ -2135,7 +1952,7 @@
             </a:gs>
           </a:gsLst>
           <a:lin ang="5400000" scaled="0"/>
-          <a:tileRect l="0" t="0" r="0" b="0"/>
+          <a:tileRect/>
         </a:gradFill>
       </a:fillStyleLst>
       <a:lnStyleLst>
@@ -2195,10 +2012,12 @@
             </a:gs>
           </a:gsLst>
           <a:lin ang="5400000" scaled="0"/>
-          <a:tileRect l="0" t="0" r="0" b="0"/>
+          <a:tileRect/>
         </a:gradFill>
       </a:bgFillStyleLst>
     </a:fmtScheme>
   </a:themeElements>
+  <a:objectDefaults/>
+  <a:extraClrSchemeLst/>
 </a:theme>
 </file>
</xml_diff>

<commit_message>
Improvements (?) in G45HW2form.docx
</commit_message>
<xml_diff>
--- a/java/G45HW2form.docx
+++ b/java/G45HW2form.docx
@@ -1,9 +1,10 @@
 
 <file path=word/document.xml><?xml version="1.0" encoding="utf-8"?>
-<w:document xmlns:wpc="http://schemas.microsoft.com/office/word/2010/wordprocessingCanvas" xmlns:cx="http://schemas.microsoft.com/office/drawing/2014/chartex" xmlns:cx1="http://schemas.microsoft.com/office/drawing/2015/9/8/chartex" xmlns:cx2="http://schemas.microsoft.com/office/drawing/2015/10/21/chartex" xmlns:cx3="http://schemas.microsoft.com/office/drawing/2016/5/9/chartex" xmlns:cx4="http://schemas.microsoft.com/office/drawing/2016/5/10/chartex" xmlns:cx5="http://schemas.microsoft.com/office/drawing/2016/5/11/chartex" xmlns:cx6="http://schemas.microsoft.com/office/drawing/2016/5/12/chartex" xmlns:cx7="http://schemas.microsoft.com/office/drawing/2016/5/13/chartex" xmlns:cx8="http://schemas.microsoft.com/office/drawing/2016/5/14/chartex" xmlns:mc="http://schemas.openxmlformats.org/markup-compatibility/2006" xmlns:aink="http://schemas.microsoft.com/office/drawing/2016/ink" xmlns:am3d="http://schemas.microsoft.com/office/drawing/2017/model3d" xmlns:o="urn:schemas-microsoft-com:office:office" xmlns:oel="http://schemas.microsoft.com/office/2019/extlst" xmlns:r="http://schemas.openxmlformats.org/officeDocument/2006/relationships" xmlns:m="http://schemas.openxmlformats.org/officeDocument/2006/math" xmlns:v="urn:schemas-microsoft-com:vml" xmlns:wp14="http://schemas.microsoft.com/office/word/2010/wordprocessingDrawing" xmlns:wp="http://schemas.openxmlformats.org/drawingml/2006/wordprocessingDrawing" xmlns:w10="urn:schemas-microsoft-com:office:word" xmlns:w="http://schemas.openxmlformats.org/wordprocessingml/2006/main" xmlns:w14="http://schemas.microsoft.com/office/word/2010/wordml" xmlns:w15="http://schemas.microsoft.com/office/word/2012/wordml" xmlns:w16cex="http://schemas.microsoft.com/office/word/2018/wordml/cex" xmlns:w16cid="http://schemas.microsoft.com/office/word/2016/wordml/cid" xmlns:w16="http://schemas.microsoft.com/office/word/2018/wordml" xmlns:w16du="http://schemas.microsoft.com/office/word/2023/wordml/word16du" xmlns:w16sdtdh="http://schemas.microsoft.com/office/word/2020/wordml/sdtdatahash" xmlns:w16sdtfl="http://schemas.microsoft.com/office/word/2024/wordml/sdtformatlock" xmlns:w16se="http://schemas.microsoft.com/office/word/2015/wordml/symex" xmlns:wpg="http://schemas.microsoft.com/office/word/2010/wordprocessingGroup" xmlns:wpi="http://schemas.microsoft.com/office/word/2010/wordprocessingInk" xmlns:wne="http://schemas.microsoft.com/office/word/2006/wordml" xmlns:wps="http://schemas.microsoft.com/office/word/2010/wordprocessingShape" mc:Ignorable="w14 w15 w16se w16cid w16 w16cex w16sdtdh w16sdtfl w16du wp14">
+<w:document xmlns:o="urn:schemas-microsoft-com:office:office" xmlns:r="http://schemas.openxmlformats.org/officeDocument/2006/relationships" xmlns:v="urn:schemas-microsoft-com:vml" xmlns:w="http://schemas.openxmlformats.org/wordprocessingml/2006/main" xmlns:w10="urn:schemas-microsoft-com:office:word" xmlns:wp="http://schemas.openxmlformats.org/drawingml/2006/wordprocessingDrawing" xmlns:pic="http://schemas.openxmlformats.org/drawingml/2006/picture" xmlns:wps="http://schemas.microsoft.com/office/word/2010/wordprocessingShape" xmlns:wpg="http://schemas.microsoft.com/office/word/2010/wordprocessingGroup" xmlns:mc="http://schemas.openxmlformats.org/markup-compatibility/2006" xmlns:wp14="http://schemas.microsoft.com/office/word/2010/wordprocessingDrawing" xmlns:w14="http://schemas.microsoft.com/office/word/2010/wordml" xmlns:w15="http://schemas.microsoft.com/office/word/2012/wordml" mc:Ignorable="w14 wp14 w15">
   <w:body>
     <w:p>
       <w:pPr>
+        <w:pStyle w:val="Normal"/>
         <w:rPr>
           <w:sz w:val="20"/>
           <w:szCs w:val="20"/>
@@ -27,6 +28,7 @@
     </w:p>
     <w:p>
       <w:pPr>
+        <w:pStyle w:val="Normal"/>
         <w:rPr>
           <w:color w:val="FF0000"/>
           <w:sz w:val="20"/>
@@ -53,6 +55,7 @@
     </w:p>
     <w:p>
       <w:pPr>
+        <w:pStyle w:val="Normal"/>
         <w:rPr>
           <w:sz w:val="20"/>
           <w:szCs w:val="20"/>
@@ -104,6 +107,7 @@
     </w:p>
     <w:p>
       <w:pPr>
+        <w:pStyle w:val="Normal"/>
         <w:rPr>
           <w:sz w:val="20"/>
           <w:szCs w:val="20"/>
@@ -139,6 +143,7 @@
     </w:p>
     <w:p>
       <w:pPr>
+        <w:pStyle w:val="Normal"/>
         <w:rPr>
           <w:sz w:val="20"/>
           <w:szCs w:val="20"/>
@@ -165,6 +170,7 @@
     </w:p>
     <w:p>
       <w:pPr>
+        <w:pStyle w:val="Normal"/>
         <w:rPr>
           <w:b/>
           <w:bCs/>
@@ -198,28 +204,40 @@
       <w:tblPr>
         <w:tblStyle w:val="Grigliatabella"/>
         <w:tblW w:w="7650" w:type="dxa"/>
+        <w:jc w:val="left"/>
+        <w:tblInd w:w="0" w:type="dxa"/>
         <w:tblLayout w:type="fixed"/>
-        <w:tblLook w:val="04A0" w:firstRow="1" w:lastRow="0" w:firstColumn="1" w:lastColumn="0" w:noHBand="0" w:noVBand="1"/>
+        <w:tblCellMar>
+          <w:top w:w="0" w:type="dxa"/>
+          <w:left w:w="108" w:type="dxa"/>
+          <w:bottom w:w="0" w:type="dxa"/>
+          <w:right w:w="108" w:type="dxa"/>
+        </w:tblCellMar>
+        <w:tblLook w:val="04a0" w:noHBand="0" w:noVBand="1" w:firstColumn="1" w:lastRow="0" w:lastColumn="0" w:firstRow="1"/>
       </w:tblPr>
       <w:tblGrid>
-        <w:gridCol w:w="1271"/>
-        <w:gridCol w:w="1844"/>
-        <w:gridCol w:w="1843"/>
+        <w:gridCol w:w="1270"/>
+        <w:gridCol w:w="1845"/>
+        <w:gridCol w:w="1842"/>
         <w:gridCol w:w="2692"/>
       </w:tblGrid>
       <w:tr>
         <w:trPr>
-          <w:trHeight w:val="20"/>
+          <w:trHeight w:val="20" w:hRule="atLeast"/>
         </w:trPr>
         <w:tc>
           <w:tcPr>
             <w:tcW w:w="7649" w:type="dxa"/>
             <w:gridSpan w:val="4"/>
+            <w:tcBorders/>
             <w:vAlign w:val="center"/>
           </w:tcPr>
           <w:p>
             <w:pPr>
-              <w:spacing w:after="0" w:line="240" w:lineRule="auto"/>
+              <w:pStyle w:val="Normal"/>
+              <w:widowControl/>
+              <w:suppressAutoHyphens w:val="true"/>
+              <w:spacing w:lineRule="auto" w:line="240" w:before="0" w:after="0"/>
               <w:jc w:val="center"/>
               <w:rPr>
                 <w:b/>
@@ -230,12 +248,13 @@
             </w:pPr>
             <w:r>
               <w:rPr>
-                <w:rFonts w:eastAsia="Calibri"/>
+                <w:rFonts w:eastAsia="Calibri" w:cs=""/>
                 <w:b/>
                 <w:color w:val="FF0000"/>
+                <w:kern w:val="0"/>
                 <w:sz w:val="20"/>
                 <w:szCs w:val="20"/>
-                <w:lang w:val="en-US"/>
+                <w:lang w:val="en-US" w:eastAsia="en-US" w:bidi="ar-SA"/>
               </w:rPr>
               <w:t>SCALABILITY WITH RESPECT TO NUMBER OF EXECUTORS</w:t>
             </w:r>
@@ -244,15 +263,20 @@
       </w:tr>
       <w:tr>
         <w:trPr>
-          <w:trHeight w:val="20"/>
+          <w:trHeight w:val="20" w:hRule="atLeast"/>
         </w:trPr>
         <w:tc>
           <w:tcPr>
             <w:tcW w:w="1270" w:type="dxa"/>
+            <w:tcBorders/>
           </w:tcPr>
           <w:p>
             <w:pPr>
-              <w:spacing w:after="0" w:line="240" w:lineRule="auto"/>
+              <w:pStyle w:val="Normal"/>
+              <w:widowControl/>
+              <w:suppressAutoHyphens w:val="true"/>
+              <w:spacing w:lineRule="auto" w:line="240" w:before="0" w:after="0"/>
+              <w:jc w:val="left"/>
               <w:rPr>
                 <w:b/>
                 <w:bCs/>
@@ -260,9 +284,13 @@
             </w:pPr>
             <w:r>
               <w:rPr>
-                <w:rFonts w:eastAsia="Calibri"/>
+                <w:rFonts w:eastAsia="Calibri" w:cs=""/>
                 <w:b/>
                 <w:bCs/>
+                <w:kern w:val="0"/>
+                <w:sz w:val="22"/>
+                <w:szCs w:val="22"/>
+                <w:lang w:val="it-IT" w:eastAsia="en-US" w:bidi="ar-SA"/>
               </w:rPr>
               <w:t>Number of executors</w:t>
             </w:r>
@@ -270,11 +298,16 @@
         </w:tc>
         <w:tc>
           <w:tcPr>
-            <w:tcW w:w="1844" w:type="dxa"/>
+            <w:tcW w:w="1845" w:type="dxa"/>
+            <w:tcBorders/>
           </w:tcPr>
           <w:p>
             <w:pPr>
-              <w:spacing w:after="0" w:line="240" w:lineRule="auto"/>
+              <w:pStyle w:val="Normal"/>
+              <w:widowControl/>
+              <w:suppressAutoHyphens w:val="true"/>
+              <w:spacing w:lineRule="auto" w:line="240" w:before="0" w:after="0"/>
+              <w:jc w:val="left"/>
               <w:rPr>
                 <w:b/>
                 <w:bCs/>
@@ -282,21 +315,41 @@
             </w:pPr>
             <w:r>
               <w:rPr>
-                <w:rFonts w:eastAsia="Calibri"/>
+                <w:rFonts w:eastAsia="Calibri" w:cs=""/>
                 <w:b/>
                 <w:bCs/>
-              </w:rPr>
-              <w:t xml:space="preserve"> Spark Lloyd’s implementation</w:t>
+                <w:kern w:val="0"/>
+                <w:sz w:val="22"/>
+                <w:szCs w:val="22"/>
+                <w:lang w:val="it-IT" w:eastAsia="en-US" w:bidi="ar-SA"/>
+              </w:rPr>
+              <w:t xml:space="preserve"> </w:t>
+            </w:r>
+            <w:r>
+              <w:rPr>
+                <w:rFonts w:eastAsia="Calibri" w:cs=""/>
+                <w:b/>
+                <w:bCs/>
+                <w:kern w:val="0"/>
+                <w:sz w:val="22"/>
+                <w:szCs w:val="22"/>
+                <w:lang w:val="it-IT" w:eastAsia="en-US" w:bidi="ar-SA"/>
+              </w:rPr>
+              <w:t>Spark Lloyd’s implementation</w:t>
             </w:r>
           </w:p>
         </w:tc>
         <w:tc>
           <w:tcPr>
-            <w:tcW w:w="1843" w:type="dxa"/>
+            <w:tcW w:w="1842" w:type="dxa"/>
+            <w:tcBorders/>
           </w:tcPr>
           <w:p>
             <w:pPr>
-              <w:spacing w:after="0" w:line="240" w:lineRule="auto"/>
+              <w:pStyle w:val="Normal"/>
+              <w:widowControl/>
+              <w:suppressAutoHyphens w:val="true"/>
+              <w:spacing w:lineRule="auto" w:line="240" w:before="0" w:after="0"/>
               <w:jc w:val="center"/>
               <w:rPr>
                 <w:b/>
@@ -305,9 +358,13 @@
             </w:pPr>
             <w:r>
               <w:rPr>
-                <w:rFonts w:eastAsia="Calibri"/>
+                <w:rFonts w:eastAsia="Calibri" w:cs=""/>
                 <w:b/>
                 <w:bCs/>
+                <w:kern w:val="0"/>
+                <w:sz w:val="22"/>
+                <w:szCs w:val="22"/>
+                <w:lang w:val="it-IT" w:eastAsia="en-US" w:bidi="ar-SA"/>
               </w:rPr>
               <w:t>MRFairLloyd</w:t>
             </w:r>
@@ -316,10 +373,15 @@
         <w:tc>
           <w:tcPr>
             <w:tcW w:w="2692" w:type="dxa"/>
+            <w:tcBorders/>
           </w:tcPr>
           <w:p>
             <w:pPr>
-              <w:spacing w:after="0" w:line="240" w:lineRule="auto"/>
+              <w:pStyle w:val="Normal"/>
+              <w:widowControl/>
+              <w:suppressAutoHyphens w:val="true"/>
+              <w:spacing w:lineRule="auto" w:line="240" w:before="0" w:after="0"/>
+              <w:jc w:val="left"/>
               <w:rPr>
                 <w:b/>
                 <w:bCs/>
@@ -327,33 +389,46 @@
             </w:pPr>
             <w:r>
               <w:rPr>
-                <w:rFonts w:eastAsia="Calibri"/>
+                <w:rFonts w:eastAsia="Calibri" w:cs=""/>
                 <w:b/>
                 <w:bCs/>
-              </w:rPr>
-              <w:t xml:space="preserve">MRComputeFairObjective </w:t>
+                <w:kern w:val="0"/>
+                <w:sz w:val="22"/>
+                <w:szCs w:val="22"/>
+                <w:lang w:val="it-IT" w:eastAsia="en-US" w:bidi="ar-SA"/>
+              </w:rPr>
+              <w:t>MRComputeFairObjective</w:t>
             </w:r>
           </w:p>
         </w:tc>
       </w:tr>
       <w:tr>
         <w:trPr>
-          <w:trHeight w:val="20"/>
+          <w:trHeight w:val="20" w:hRule="atLeast"/>
         </w:trPr>
         <w:tc>
           <w:tcPr>
             <w:tcW w:w="1270" w:type="dxa"/>
+            <w:tcBorders/>
           </w:tcPr>
           <w:p>
             <w:pPr>
-              <w:spacing w:after="0" w:line="240" w:lineRule="auto"/>
-              <w:rPr>
-                <w:rFonts w:ascii="Calibri" w:eastAsia="Calibri" w:hAnsi="Calibri"/>
+              <w:pStyle w:val="Normal"/>
+              <w:widowControl/>
+              <w:suppressAutoHyphens w:val="true"/>
+              <w:spacing w:lineRule="auto" w:line="240" w:before="0" w:after="0"/>
+              <w:jc w:val="left"/>
+              <w:rPr>
+                <w:rFonts w:ascii="Calibri" w:hAnsi="Calibri" w:eastAsia="Calibri"/>
               </w:rPr>
             </w:pPr>
             <w:r>
               <w:rPr>
-                <w:rFonts w:eastAsia="Calibri"/>
+                <w:rFonts w:eastAsia="Calibri" w:cs="" w:ascii="Calibri" w:hAnsi="Calibri"/>
+                <w:kern w:val="0"/>
+                <w:sz w:val="22"/>
+                <w:szCs w:val="22"/>
+                <w:lang w:val="it-IT" w:eastAsia="en-US" w:bidi="ar-SA"/>
               </w:rPr>
               <w:t>2</w:t>
             </w:r>
@@ -361,18 +436,27 @@
         </w:tc>
         <w:tc>
           <w:tcPr>
-            <w:tcW w:w="1844" w:type="dxa"/>
+            <w:tcW w:w="1845" w:type="dxa"/>
+            <w:tcBorders/>
           </w:tcPr>
           <w:p>
             <w:pPr>
-              <w:spacing w:after="0" w:line="240" w:lineRule="auto"/>
-              <w:rPr>
-                <w:rFonts w:ascii="Calibri" w:eastAsia="Calibri" w:hAnsi="Calibri"/>
+              <w:pStyle w:val="Normal"/>
+              <w:widowControl/>
+              <w:suppressAutoHyphens w:val="true"/>
+              <w:spacing w:lineRule="auto" w:line="240" w:before="0" w:after="0"/>
+              <w:jc w:val="left"/>
+              <w:rPr>
+                <w:rFonts w:ascii="Calibri" w:hAnsi="Calibri" w:eastAsia="Calibri"/>
               </w:rPr>
             </w:pPr>
             <w:r>
               <w:rPr>
-                <w:rFonts w:eastAsia="Calibri"/>
+                <w:rFonts w:eastAsia="Calibri" w:cs="" w:ascii="Calibri" w:hAnsi="Calibri"/>
+                <w:kern w:val="0"/>
+                <w:sz w:val="22"/>
+                <w:szCs w:val="22"/>
+                <w:lang w:val="it-IT" w:eastAsia="en-US" w:bidi="ar-SA"/>
               </w:rPr>
               <w:t>13545</w:t>
             </w:r>
@@ -380,18 +464,27 @@
         </w:tc>
         <w:tc>
           <w:tcPr>
-            <w:tcW w:w="1843" w:type="dxa"/>
+            <w:tcW w:w="1842" w:type="dxa"/>
+            <w:tcBorders/>
           </w:tcPr>
           <w:p>
             <w:pPr>
-              <w:spacing w:after="0" w:line="240" w:lineRule="auto"/>
-              <w:rPr>
-                <w:rFonts w:ascii="Calibri" w:eastAsia="Calibri" w:hAnsi="Calibri"/>
+              <w:pStyle w:val="Normal"/>
+              <w:widowControl/>
+              <w:suppressAutoHyphens w:val="true"/>
+              <w:spacing w:lineRule="auto" w:line="240" w:before="0" w:after="0"/>
+              <w:jc w:val="left"/>
+              <w:rPr>
+                <w:rFonts w:ascii="Calibri" w:hAnsi="Calibri" w:eastAsia="Calibri"/>
               </w:rPr>
             </w:pPr>
             <w:r>
               <w:rPr>
-                <w:rFonts w:eastAsia="Calibri"/>
+                <w:rFonts w:eastAsia="Calibri" w:cs="" w:ascii="Calibri" w:hAnsi="Calibri"/>
+                <w:kern w:val="0"/>
+                <w:sz w:val="22"/>
+                <w:szCs w:val="22"/>
+                <w:lang w:val="it-IT" w:eastAsia="en-US" w:bidi="ar-SA"/>
               </w:rPr>
               <w:t>54760</w:t>
             </w:r>
@@ -400,17 +493,26 @@
         <w:tc>
           <w:tcPr>
             <w:tcW w:w="2692" w:type="dxa"/>
+            <w:tcBorders/>
           </w:tcPr>
           <w:p>
             <w:pPr>
-              <w:spacing w:after="0" w:line="240" w:lineRule="auto"/>
-              <w:rPr>
-                <w:rFonts w:ascii="Calibri" w:eastAsia="Calibri" w:hAnsi="Calibri"/>
+              <w:pStyle w:val="Normal"/>
+              <w:widowControl/>
+              <w:suppressAutoHyphens w:val="true"/>
+              <w:spacing w:lineRule="auto" w:line="240" w:before="0" w:after="0"/>
+              <w:jc w:val="left"/>
+              <w:rPr>
+                <w:rFonts w:ascii="Calibri" w:hAnsi="Calibri" w:eastAsia="Calibri"/>
               </w:rPr>
             </w:pPr>
             <w:r>
               <w:rPr>
-                <w:rFonts w:eastAsia="Calibri"/>
+                <w:rFonts w:eastAsia="Calibri" w:cs="" w:ascii="Calibri" w:hAnsi="Calibri"/>
+                <w:kern w:val="0"/>
+                <w:sz w:val="22"/>
+                <w:szCs w:val="22"/>
+                <w:lang w:val="it-IT" w:eastAsia="en-US" w:bidi="ar-SA"/>
               </w:rPr>
               <w:t>1388</w:t>
             </w:r>
@@ -419,22 +521,31 @@
       </w:tr>
       <w:tr>
         <w:trPr>
-          <w:trHeight w:val="20"/>
+          <w:trHeight w:val="20" w:hRule="atLeast"/>
         </w:trPr>
         <w:tc>
           <w:tcPr>
             <w:tcW w:w="1270" w:type="dxa"/>
+            <w:tcBorders/>
           </w:tcPr>
           <w:p>
             <w:pPr>
-              <w:spacing w:after="0" w:line="240" w:lineRule="auto"/>
-              <w:rPr>
-                <w:rFonts w:ascii="Calibri" w:eastAsia="Calibri" w:hAnsi="Calibri"/>
+              <w:pStyle w:val="Normal"/>
+              <w:widowControl/>
+              <w:suppressAutoHyphens w:val="true"/>
+              <w:spacing w:lineRule="auto" w:line="240" w:before="0" w:after="0"/>
+              <w:jc w:val="left"/>
+              <w:rPr>
+                <w:rFonts w:ascii="Calibri" w:hAnsi="Calibri" w:eastAsia="Calibri"/>
               </w:rPr>
             </w:pPr>
             <w:r>
               <w:rPr>
-                <w:rFonts w:eastAsia="Calibri"/>
+                <w:rFonts w:eastAsia="Calibri" w:cs="" w:ascii="Calibri" w:hAnsi="Calibri"/>
+                <w:kern w:val="0"/>
+                <w:sz w:val="22"/>
+                <w:szCs w:val="22"/>
+                <w:lang w:val="it-IT" w:eastAsia="en-US" w:bidi="ar-SA"/>
               </w:rPr>
               <w:t>4</w:t>
             </w:r>
@@ -442,18 +553,27 @@
         </w:tc>
         <w:tc>
           <w:tcPr>
-            <w:tcW w:w="1844" w:type="dxa"/>
+            <w:tcW w:w="1845" w:type="dxa"/>
+            <w:tcBorders/>
           </w:tcPr>
           <w:p>
             <w:pPr>
-              <w:spacing w:after="0" w:line="240" w:lineRule="auto"/>
-              <w:rPr>
-                <w:rFonts w:ascii="Calibri" w:eastAsia="Calibri" w:hAnsi="Calibri"/>
+              <w:pStyle w:val="Normal"/>
+              <w:widowControl/>
+              <w:suppressAutoHyphens w:val="true"/>
+              <w:spacing w:lineRule="auto" w:line="240" w:before="0" w:after="0"/>
+              <w:jc w:val="left"/>
+              <w:rPr>
+                <w:rFonts w:ascii="Calibri" w:hAnsi="Calibri" w:eastAsia="Calibri"/>
               </w:rPr>
             </w:pPr>
             <w:r>
               <w:rPr>
-                <w:rFonts w:eastAsia="Calibri"/>
+                <w:rFonts w:eastAsia="Calibri" w:cs="" w:ascii="Calibri" w:hAnsi="Calibri"/>
+                <w:kern w:val="0"/>
+                <w:sz w:val="22"/>
+                <w:szCs w:val="22"/>
+                <w:lang w:val="it-IT" w:eastAsia="en-US" w:bidi="ar-SA"/>
               </w:rPr>
               <w:t>8441</w:t>
             </w:r>
@@ -461,18 +581,27 @@
         </w:tc>
         <w:tc>
           <w:tcPr>
-            <w:tcW w:w="1843" w:type="dxa"/>
+            <w:tcW w:w="1842" w:type="dxa"/>
+            <w:tcBorders/>
           </w:tcPr>
           <w:p>
             <w:pPr>
-              <w:spacing w:after="0" w:line="240" w:lineRule="auto"/>
-              <w:rPr>
-                <w:rFonts w:ascii="Calibri" w:eastAsia="Calibri" w:hAnsi="Calibri"/>
+              <w:pStyle w:val="Normal"/>
+              <w:widowControl/>
+              <w:suppressAutoHyphens w:val="true"/>
+              <w:spacing w:lineRule="auto" w:line="240" w:before="0" w:after="0"/>
+              <w:jc w:val="left"/>
+              <w:rPr>
+                <w:rFonts w:ascii="Calibri" w:hAnsi="Calibri" w:eastAsia="Calibri"/>
               </w:rPr>
             </w:pPr>
             <w:r>
               <w:rPr>
-                <w:rFonts w:eastAsia="Calibri"/>
+                <w:rFonts w:eastAsia="Calibri" w:cs="" w:ascii="Calibri" w:hAnsi="Calibri"/>
+                <w:kern w:val="0"/>
+                <w:sz w:val="22"/>
+                <w:szCs w:val="22"/>
+                <w:lang w:val="it-IT" w:eastAsia="en-US" w:bidi="ar-SA"/>
               </w:rPr>
               <w:t>26475</w:t>
             </w:r>
@@ -481,17 +610,26 @@
         <w:tc>
           <w:tcPr>
             <w:tcW w:w="2692" w:type="dxa"/>
+            <w:tcBorders/>
           </w:tcPr>
           <w:p>
             <w:pPr>
-              <w:spacing w:after="0" w:line="240" w:lineRule="auto"/>
-              <w:rPr>
-                <w:rFonts w:ascii="Calibri" w:eastAsia="Calibri" w:hAnsi="Calibri"/>
+              <w:pStyle w:val="Normal"/>
+              <w:widowControl/>
+              <w:suppressAutoHyphens w:val="true"/>
+              <w:spacing w:lineRule="auto" w:line="240" w:before="0" w:after="0"/>
+              <w:jc w:val="left"/>
+              <w:rPr>
+                <w:rFonts w:ascii="Calibri" w:hAnsi="Calibri" w:eastAsia="Calibri"/>
               </w:rPr>
             </w:pPr>
             <w:r>
               <w:rPr>
-                <w:rFonts w:eastAsia="Calibri"/>
+                <w:rFonts w:eastAsia="Calibri" w:cs="" w:ascii="Calibri" w:hAnsi="Calibri"/>
+                <w:kern w:val="0"/>
+                <w:sz w:val="22"/>
+                <w:szCs w:val="22"/>
+                <w:lang w:val="it-IT" w:eastAsia="en-US" w:bidi="ar-SA"/>
               </w:rPr>
               <w:t>655</w:t>
             </w:r>
@@ -500,22 +638,31 @@
       </w:tr>
       <w:tr>
         <w:trPr>
-          <w:trHeight w:val="20"/>
+          <w:trHeight w:val="20" w:hRule="atLeast"/>
         </w:trPr>
         <w:tc>
           <w:tcPr>
             <w:tcW w:w="1270" w:type="dxa"/>
+            <w:tcBorders/>
           </w:tcPr>
           <w:p>
             <w:pPr>
-              <w:spacing w:after="0" w:line="240" w:lineRule="auto"/>
-              <w:rPr>
-                <w:rFonts w:ascii="Calibri" w:eastAsia="Calibri" w:hAnsi="Calibri"/>
+              <w:pStyle w:val="Normal"/>
+              <w:widowControl/>
+              <w:suppressAutoHyphens w:val="true"/>
+              <w:spacing w:lineRule="auto" w:line="240" w:before="0" w:after="0"/>
+              <w:jc w:val="left"/>
+              <w:rPr>
+                <w:rFonts w:ascii="Calibri" w:hAnsi="Calibri" w:eastAsia="Calibri"/>
               </w:rPr>
             </w:pPr>
             <w:r>
               <w:rPr>
-                <w:rFonts w:eastAsia="Calibri"/>
+                <w:rFonts w:eastAsia="Calibri" w:cs="" w:ascii="Calibri" w:hAnsi="Calibri"/>
+                <w:kern w:val="0"/>
+                <w:sz w:val="22"/>
+                <w:szCs w:val="22"/>
+                <w:lang w:val="it-IT" w:eastAsia="en-US" w:bidi="ar-SA"/>
               </w:rPr>
               <w:t>8</w:t>
             </w:r>
@@ -523,18 +670,27 @@
         </w:tc>
         <w:tc>
           <w:tcPr>
-            <w:tcW w:w="1844" w:type="dxa"/>
+            <w:tcW w:w="1845" w:type="dxa"/>
+            <w:tcBorders/>
           </w:tcPr>
           <w:p>
             <w:pPr>
-              <w:spacing w:after="0" w:line="240" w:lineRule="auto"/>
-              <w:rPr>
-                <w:rFonts w:ascii="Calibri" w:eastAsia="Calibri" w:hAnsi="Calibri"/>
+              <w:pStyle w:val="Normal"/>
+              <w:widowControl/>
+              <w:suppressAutoHyphens w:val="true"/>
+              <w:spacing w:lineRule="auto" w:line="240" w:before="0" w:after="0"/>
+              <w:jc w:val="left"/>
+              <w:rPr>
+                <w:rFonts w:ascii="Calibri" w:hAnsi="Calibri" w:eastAsia="Calibri"/>
               </w:rPr>
             </w:pPr>
             <w:r>
               <w:rPr>
-                <w:rFonts w:eastAsia="Calibri"/>
+                <w:rFonts w:eastAsia="Calibri" w:cs="" w:ascii="Calibri" w:hAnsi="Calibri"/>
+                <w:kern w:val="0"/>
+                <w:sz w:val="22"/>
+                <w:szCs w:val="22"/>
+                <w:lang w:val="it-IT" w:eastAsia="en-US" w:bidi="ar-SA"/>
               </w:rPr>
               <w:t>4812</w:t>
             </w:r>
@@ -542,18 +698,27 @@
         </w:tc>
         <w:tc>
           <w:tcPr>
-            <w:tcW w:w="1843" w:type="dxa"/>
+            <w:tcW w:w="1842" w:type="dxa"/>
+            <w:tcBorders/>
           </w:tcPr>
           <w:p>
             <w:pPr>
-              <w:spacing w:after="0" w:line="240" w:lineRule="auto"/>
-              <w:rPr>
-                <w:rFonts w:ascii="Calibri" w:eastAsia="Calibri" w:hAnsi="Calibri"/>
+              <w:pStyle w:val="Normal"/>
+              <w:widowControl/>
+              <w:suppressAutoHyphens w:val="true"/>
+              <w:spacing w:lineRule="auto" w:line="240" w:before="0" w:after="0"/>
+              <w:jc w:val="left"/>
+              <w:rPr>
+                <w:rFonts w:ascii="Calibri" w:hAnsi="Calibri" w:eastAsia="Calibri"/>
               </w:rPr>
             </w:pPr>
             <w:r>
               <w:rPr>
-                <w:rFonts w:eastAsia="Calibri"/>
+                <w:rFonts w:eastAsia="Calibri" w:cs="" w:ascii="Calibri" w:hAnsi="Calibri"/>
+                <w:kern w:val="0"/>
+                <w:sz w:val="22"/>
+                <w:szCs w:val="22"/>
+                <w:lang w:val="it-IT" w:eastAsia="en-US" w:bidi="ar-SA"/>
               </w:rPr>
               <w:t>16384</w:t>
             </w:r>
@@ -562,17 +727,26 @@
         <w:tc>
           <w:tcPr>
             <w:tcW w:w="2692" w:type="dxa"/>
+            <w:tcBorders/>
           </w:tcPr>
           <w:p>
             <w:pPr>
-              <w:spacing w:after="0" w:line="240" w:lineRule="auto"/>
-              <w:rPr>
-                <w:rFonts w:ascii="Calibri" w:eastAsia="Calibri" w:hAnsi="Calibri"/>
+              <w:pStyle w:val="Normal"/>
+              <w:widowControl/>
+              <w:suppressAutoHyphens w:val="true"/>
+              <w:spacing w:lineRule="auto" w:line="240" w:before="0" w:after="0"/>
+              <w:jc w:val="left"/>
+              <w:rPr>
+                <w:rFonts w:ascii="Calibri" w:hAnsi="Calibri" w:eastAsia="Calibri"/>
               </w:rPr>
             </w:pPr>
             <w:r>
               <w:rPr>
-                <w:rFonts w:eastAsia="Calibri"/>
+                <w:rFonts w:eastAsia="Calibri" w:cs="" w:ascii="Calibri" w:hAnsi="Calibri"/>
+                <w:kern w:val="0"/>
+                <w:sz w:val="22"/>
+                <w:szCs w:val="22"/>
+                <w:lang w:val="it-IT" w:eastAsia="en-US" w:bidi="ar-SA"/>
               </w:rPr>
               <w:t>465</w:t>
             </w:r>
@@ -581,22 +755,31 @@
       </w:tr>
       <w:tr>
         <w:trPr>
-          <w:trHeight w:val="20"/>
+          <w:trHeight w:val="20" w:hRule="atLeast"/>
         </w:trPr>
         <w:tc>
           <w:tcPr>
             <w:tcW w:w="1270" w:type="dxa"/>
+            <w:tcBorders/>
           </w:tcPr>
           <w:p>
             <w:pPr>
-              <w:spacing w:after="0" w:line="240" w:lineRule="auto"/>
-              <w:rPr>
-                <w:rFonts w:ascii="Calibri" w:eastAsia="Calibri" w:hAnsi="Calibri"/>
+              <w:pStyle w:val="Normal"/>
+              <w:widowControl/>
+              <w:suppressAutoHyphens w:val="true"/>
+              <w:spacing w:lineRule="auto" w:line="240" w:before="0" w:after="0"/>
+              <w:jc w:val="left"/>
+              <w:rPr>
+                <w:rFonts w:ascii="Calibri" w:hAnsi="Calibri" w:eastAsia="Calibri"/>
               </w:rPr>
             </w:pPr>
             <w:r>
               <w:rPr>
-                <w:rFonts w:eastAsia="Calibri"/>
+                <w:rFonts w:eastAsia="Calibri" w:cs="" w:ascii="Calibri" w:hAnsi="Calibri"/>
+                <w:kern w:val="0"/>
+                <w:sz w:val="22"/>
+                <w:szCs w:val="22"/>
+                <w:lang w:val="it-IT" w:eastAsia="en-US" w:bidi="ar-SA"/>
               </w:rPr>
               <w:t>16</w:t>
             </w:r>
@@ -604,18 +787,27 @@
         </w:tc>
         <w:tc>
           <w:tcPr>
-            <w:tcW w:w="1844" w:type="dxa"/>
+            <w:tcW w:w="1845" w:type="dxa"/>
+            <w:tcBorders/>
           </w:tcPr>
           <w:p>
             <w:pPr>
-              <w:spacing w:after="0" w:line="240" w:lineRule="auto"/>
-              <w:rPr>
-                <w:rFonts w:ascii="Calibri" w:eastAsia="Calibri" w:hAnsi="Calibri"/>
+              <w:pStyle w:val="Normal"/>
+              <w:widowControl/>
+              <w:suppressAutoHyphens w:val="true"/>
+              <w:spacing w:lineRule="auto" w:line="240" w:before="0" w:after="0"/>
+              <w:jc w:val="left"/>
+              <w:rPr>
+                <w:rFonts w:ascii="Calibri" w:hAnsi="Calibri" w:eastAsia="Calibri"/>
               </w:rPr>
             </w:pPr>
             <w:r>
               <w:rPr>
-                <w:rFonts w:eastAsia="Calibri"/>
+                <w:rFonts w:eastAsia="Calibri" w:cs="" w:ascii="Calibri" w:hAnsi="Calibri"/>
+                <w:kern w:val="0"/>
+                <w:sz w:val="22"/>
+                <w:szCs w:val="22"/>
+                <w:lang w:val="it-IT" w:eastAsia="en-US" w:bidi="ar-SA"/>
               </w:rPr>
               <w:t>3840</w:t>
             </w:r>
@@ -623,18 +815,27 @@
         </w:tc>
         <w:tc>
           <w:tcPr>
-            <w:tcW w:w="1843" w:type="dxa"/>
+            <w:tcW w:w="1842" w:type="dxa"/>
+            <w:tcBorders/>
           </w:tcPr>
           <w:p>
             <w:pPr>
-              <w:spacing w:after="0" w:line="240" w:lineRule="auto"/>
-              <w:rPr>
-                <w:rFonts w:ascii="Calibri" w:eastAsia="Calibri" w:hAnsi="Calibri"/>
+              <w:pStyle w:val="Normal"/>
+              <w:widowControl/>
+              <w:suppressAutoHyphens w:val="true"/>
+              <w:spacing w:lineRule="auto" w:line="240" w:before="0" w:after="0"/>
+              <w:jc w:val="left"/>
+              <w:rPr>
+                <w:rFonts w:ascii="Calibri" w:hAnsi="Calibri" w:eastAsia="Calibri"/>
               </w:rPr>
             </w:pPr>
             <w:r>
               <w:rPr>
-                <w:rFonts w:eastAsia="Calibri"/>
+                <w:rFonts w:eastAsia="Calibri" w:cs="" w:ascii="Calibri" w:hAnsi="Calibri"/>
+                <w:kern w:val="0"/>
+                <w:sz w:val="22"/>
+                <w:szCs w:val="22"/>
+                <w:lang w:val="it-IT" w:eastAsia="en-US" w:bidi="ar-SA"/>
               </w:rPr>
               <w:t>11316</w:t>
             </w:r>
@@ -643,17 +844,26 @@
         <w:tc>
           <w:tcPr>
             <w:tcW w:w="2692" w:type="dxa"/>
+            <w:tcBorders/>
           </w:tcPr>
           <w:p>
             <w:pPr>
-              <w:spacing w:after="0" w:line="240" w:lineRule="auto"/>
-              <w:rPr>
-                <w:rFonts w:ascii="Calibri" w:eastAsia="Calibri" w:hAnsi="Calibri"/>
+              <w:pStyle w:val="Normal"/>
+              <w:widowControl/>
+              <w:suppressAutoHyphens w:val="true"/>
+              <w:spacing w:lineRule="auto" w:line="240" w:before="0" w:after="0"/>
+              <w:jc w:val="left"/>
+              <w:rPr>
+                <w:rFonts w:ascii="Calibri" w:hAnsi="Calibri" w:eastAsia="Calibri"/>
               </w:rPr>
             </w:pPr>
             <w:r>
               <w:rPr>
-                <w:rFonts w:eastAsia="Calibri"/>
+                <w:rFonts w:eastAsia="Calibri" w:cs="" w:ascii="Calibri" w:hAnsi="Calibri"/>
+                <w:kern w:val="0"/>
+                <w:sz w:val="22"/>
+                <w:szCs w:val="22"/>
+                <w:lang w:val="it-IT" w:eastAsia="en-US" w:bidi="ar-SA"/>
               </w:rPr>
               <w:t>270</w:t>
             </w:r>
@@ -661,9 +871,18 @@
         </w:tc>
       </w:tr>
     </w:tbl>
-    <w:p/>
     <w:p>
       <w:pPr>
+        <w:pStyle w:val="Normal"/>
+        <w:rPr/>
+      </w:pPr>
+      <w:r>
+        <w:rPr/>
+      </w:r>
+    </w:p>
+    <w:p>
+      <w:pPr>
+        <w:pStyle w:val="Normal"/>
         <w:rPr>
           <w:b/>
           <w:bCs/>
@@ -685,12 +904,12 @@
     </w:p>
     <w:p>
       <w:pPr>
-        <w:pStyle w:val="Paragrafoelenco"/>
+        <w:pStyle w:val="ListParagraph"/>
         <w:numPr>
           <w:ilvl w:val="0"/>
           <w:numId w:val="1"/>
         </w:numPr>
-        <w:ind w:left="284" w:hanging="284"/>
+        <w:ind w:hanging="284" w:left="284"/>
         <w:rPr>
           <w:sz w:val="20"/>
           <w:szCs w:val="20"/>
@@ -708,12 +927,12 @@
     </w:p>
     <w:p>
       <w:pPr>
-        <w:pStyle w:val="Paragrafoelenco"/>
+        <w:pStyle w:val="ListParagraph"/>
         <w:numPr>
           <w:ilvl w:val="0"/>
           <w:numId w:val="1"/>
         </w:numPr>
-        <w:ind w:left="284" w:hanging="284"/>
+        <w:ind w:hanging="284" w:left="284"/>
         <w:rPr>
           <w:sz w:val="20"/>
           <w:szCs w:val="20"/>
@@ -731,12 +950,12 @@
     </w:p>
     <w:p>
       <w:pPr>
-        <w:pStyle w:val="Paragrafoelenco"/>
+        <w:pStyle w:val="ListParagraph"/>
         <w:numPr>
           <w:ilvl w:val="0"/>
           <w:numId w:val="1"/>
         </w:numPr>
-        <w:ind w:left="284" w:hanging="284"/>
+        <w:ind w:hanging="284" w:left="284"/>
         <w:rPr>
           <w:sz w:val="20"/>
           <w:szCs w:val="20"/>
@@ -754,6 +973,7 @@
     </w:p>
     <w:p>
       <w:pPr>
+        <w:pStyle w:val="Normal"/>
         <w:rPr>
           <w:b/>
           <w:bCs/>
@@ -762,9 +982,19 @@
           <w:lang w:val="en-US"/>
         </w:rPr>
       </w:pPr>
+      <w:r>
+        <w:rPr>
+          <w:b/>
+          <w:bCs/>
+          <w:sz w:val="20"/>
+          <w:szCs w:val="20"/>
+          <w:lang w:val="en-US"/>
+        </w:rPr>
+      </w:r>
     </w:p>
     <w:p>
       <w:pPr>
+        <w:pStyle w:val="Normal"/>
         <w:rPr>
           <w:b/>
           <w:bCs/>
@@ -812,207 +1042,233 @@
     </w:p>
     <w:p>
       <w:pPr>
-        <w:rPr>
-          <w:lang w:val="en-US"/>
-        </w:rPr>
-      </w:pPr>
-      <w:r>
-        <w:rPr>
-          <w:lang w:val="en-US"/>
-        </w:rPr>
-        <w:t>The G45GEN.py file is a simple generator for obtaining a 4x improvement over the standard Lloyd’s algorithm (</w:t>
-      </w:r>
-      <w:r>
-        <w:rPr>
-          <w:lang w:val="en-US"/>
-        </w:rPr>
-        <w:t>if</w:t>
-      </w:r>
-      <w:r>
-        <w:rPr>
-          <w:lang w:val="en-US"/>
-        </w:rPr>
-        <w:t xml:space="preserve"> both clusterings find the optimal </w:t>
-      </w:r>
-      <w:r>
-        <w:rPr>
-          <w:lang w:val="en-US"/>
-        </w:rPr>
-        <w:t>minimum</w:t>
-      </w:r>
-      <w:r>
-        <w:rPr>
-          <w:lang w:val="en-US"/>
-        </w:rPr>
-        <w:t>)</w:t>
-      </w:r>
-      <w:r>
-        <w:rPr>
-          <w:lang w:val="en-US"/>
-        </w:rPr>
-        <w:t>.</w:t>
+        <w:pStyle w:val="Normal"/>
+        <w:rPr>
+          <w:lang w:val="en-US"/>
+        </w:rPr>
+      </w:pPr>
+      <w:r>
+        <w:rPr>
+          <w:lang w:val="en-US"/>
+        </w:rPr>
+        <w:t xml:space="preserve">The G45GEN.py </w:t>
+      </w:r>
+      <w:r>
+        <w:rPr>
+          <w:lang w:val="en-US"/>
+        </w:rPr>
+        <w:t xml:space="preserve">script generates an input for the Fair k-means problem that gets a </w:t>
+      </w:r>
+      <w:r>
+        <w:rPr>
+          <w:lang w:val="en-US"/>
+        </w:rPr>
+        <w:t xml:space="preserve">4 </w:t>
+      </w:r>
+      <w:r>
+        <w:rPr>
+          <w:lang w:val="en-US"/>
+        </w:rPr>
+        <w:t>times</w:t>
+      </w:r>
+      <w:r>
+        <w:rPr>
+          <w:lang w:val="en-US"/>
+        </w:rPr>
+        <w:t xml:space="preserve"> improvement </w:t>
+      </w:r>
+      <w:r>
+        <w:rPr>
+          <w:lang w:val="en-US"/>
+        </w:rPr>
+        <w:t xml:space="preserve">of the fair Lloyd’s algorithm </w:t>
+      </w:r>
+      <w:r>
+        <w:rPr>
+          <w:lang w:val="en-US"/>
+        </w:rPr>
+        <w:t xml:space="preserve">over the standard </w:t>
+      </w:r>
+      <w:r>
+        <w:rPr>
+          <w:lang w:val="en-US"/>
+        </w:rPr>
+        <w:t xml:space="preserve">Lloyd’s </w:t>
+      </w:r>
+      <w:r>
+        <w:rPr>
+          <w:lang w:val="en-US"/>
+        </w:rPr>
+        <w:t>algorithm (</w:t>
+      </w:r>
+      <w:r>
+        <w:rPr>
+          <w:lang w:val="en-US"/>
+        </w:rPr>
+        <w:t>assuming</w:t>
+      </w:r>
+      <w:r>
+        <w:rPr>
+          <w:lang w:val="en-US"/>
+        </w:rPr>
+        <w:t xml:space="preserve"> both clusterings find the optimal minimum).</w:t>
       </w:r>
     </w:p>
     <w:p>
       <w:pPr>
-        <w:rPr>
-          <w:lang w:val="en-US"/>
-        </w:rPr>
-      </w:pPr>
-      <w:r>
-        <w:rPr>
-          <w:lang w:val="en-US"/>
-        </w:rPr>
-        <w:t>The only point of group B is placed in the origin. Group B has a single point to create the maximum imbalance possible between the two algorithms.</w:t>
+        <w:pStyle w:val="Normal"/>
+        <w:rPr>
+          <w:lang w:val="en-US"/>
+        </w:rPr>
+      </w:pPr>
+      <w:r>
+        <w:rPr>
+          <w:lang w:val="en-US"/>
+        </w:rPr>
+        <w:t>The input is constructed as follows: t</w:t>
+      </w:r>
+      <w:r>
+        <w:rPr>
+          <w:lang w:val="en-US"/>
+        </w:rPr>
+        <w:t>he only point of group B is placed in the origin. Group B has a single point to create the maximum imbalance possible between the two algorithms.</w:t>
+        <w:br/>
+        <w:t>K-1 points of group A (the group of these points doesn’t really matter) are evenly placed on the circumference of radius N^2. This ensures that in the optimal clustering a center must be placed on each of the points, leaving only one center for the rest. (Maybe a radius of N^2 is a bit overkill, but just to be sure).</w:t>
+        <w:br/>
+        <w:t xml:space="preserve">Finally, N-K points of group A are all placed at coordinates (0,1), </w:t>
+      </w:r>
+      <w:r>
+        <w:rPr>
+          <w:lang w:val="en-US"/>
+        </w:rPr>
+        <w:t>or very close to this point</w:t>
+      </w:r>
+      <w:r>
+        <w:rPr>
+          <w:lang w:val="en-US"/>
+        </w:rPr>
+        <w:t xml:space="preserve">. </w:t>
+      </w:r>
+      <w:r>
+        <w:rPr>
+          <w:lang w:val="en-US"/>
+        </w:rPr>
+        <w:t>Thus</w:t>
       </w:r>
     </w:p>
     <w:p>
       <w:pPr>
-        <w:rPr>
-          <w:lang w:val="en-US"/>
-        </w:rPr>
-      </w:pPr>
-      <w:r>
-        <w:rPr>
-          <w:lang w:val="en-US"/>
-        </w:rPr>
-        <w:t>Then K-1 points of group A (the group of these points doesn’t really matter) are evenly placed on the circumference of radius N^2. This ensures that in the optimal clustering a center must be placed on each of the points, leaving only one center for the rest. (Maybe a radius of N^2 is a bit overkill, but just to be sure).</w:t>
+        <w:pStyle w:val="Normal"/>
+        <w:rPr>
+          <w:lang w:val="en-US"/>
+        </w:rPr>
+      </w:pPr>
+      <w:r>
+        <w:rPr>
+          <w:lang w:val="en-US"/>
+        </w:rPr>
+        <w:t xml:space="preserve">The </w:t>
+      </w:r>
+      <w:r>
+        <w:rPr>
+          <w:lang w:val="en-US"/>
+        </w:rPr>
+        <w:t xml:space="preserve">standard </w:t>
+      </w:r>
+      <w:r>
+        <w:rPr>
+          <w:lang w:val="en-US"/>
+        </w:rPr>
+        <w:t xml:space="preserve">Lloyd’s </w:t>
+      </w:r>
+      <w:r>
+        <w:rPr>
+          <w:lang w:val="en-US"/>
+        </w:rPr>
+        <w:t xml:space="preserve">algorithm will try to put the last center closer to the points at (0,1) (assuming there are more than one). As N gets larger, we can imagine the center to be placed </w:t>
+      </w:r>
+      <w:r>
+        <w:rPr>
+          <w:lang w:val="en-US"/>
+        </w:rPr>
+        <w:t xml:space="preserve">very close to </w:t>
+      </w:r>
+      <w:r>
+        <w:rPr>
+          <w:lang w:val="en-US"/>
+        </w:rPr>
+        <w:t xml:space="preserve">(0,1).  The fair </w:t>
+      </w:r>
+      <w:r>
+        <w:rPr>
+          <w:lang w:val="en-US"/>
+        </w:rPr>
+        <w:t>algorithm</w:t>
+      </w:r>
+      <w:r>
+        <w:rPr>
+          <w:lang w:val="en-US"/>
+        </w:rPr>
+        <w:t xml:space="preserve"> instead recognizes that the origin point counts as much as the others combined, being the only one of group B, and will put the last center </w:t>
+      </w:r>
+      <w:r>
+        <w:rPr>
+          <w:lang w:val="en-US"/>
+        </w:rPr>
+        <w:t>in</w:t>
+      </w:r>
+      <w:r>
+        <w:rPr>
+          <w:lang w:val="en-US"/>
+        </w:rPr>
+        <w:t xml:space="preserve"> position (0,1/2). </w:t>
       </w:r>
     </w:p>
     <w:p>
       <w:pPr>
-        <w:rPr>
-          <w:lang w:val="en-US"/>
-        </w:rPr>
-      </w:pPr>
-      <w:r>
-        <w:rPr>
-          <w:lang w:val="en-US"/>
-        </w:rPr>
-        <w:t xml:space="preserve">Finally, N-K points of group A are all placed at coordinates (0,1). The standard algorithm will try to put the last center closer to </w:t>
-      </w:r>
-      <w:r>
-        <w:rPr>
-          <w:lang w:val="en-US"/>
-        </w:rPr>
-        <w:t xml:space="preserve">the points at (0,1) (assuming there are more than one). As N gets larger, we can imagine the center to be placed exactly at (0,1). </w:t>
-      </w:r>
-      <w:r>
-        <w:rPr>
-          <w:lang w:val="en-US"/>
-        </w:rPr>
-        <w:t xml:space="preserve"> </w:t>
-      </w:r>
-      <w:r>
-        <w:rPr>
-          <w:lang w:val="en-US"/>
-        </w:rPr>
-        <w:t xml:space="preserve">The fair one instead recognizes that the origin point counts as much as the others combined, being the only one of group B, and will put the last center on position (0,1/2). </w:t>
+        <w:pStyle w:val="Normal"/>
+        <w:rPr>
+          <w:lang w:val="en-US"/>
+        </w:rPr>
+      </w:pPr>
+      <w:r>
+        <w:rPr>
+          <w:lang w:val="en-US"/>
+        </w:rPr>
+        <w:t>So, the fair objective for standard clustering will be 1 (distance between (0,0) and (0,1) squared), whilst the fair objective for fair clustering will be 0.25 (distance between (0,0) and (0,1/2) squared).</w:t>
       </w:r>
     </w:p>
     <w:p>
       <w:pPr>
-        <w:rPr>
-          <w:lang w:val="en-US"/>
-        </w:rPr>
-      </w:pPr>
-      <w:r>
-        <w:rPr>
-          <w:lang w:val="en-US"/>
-        </w:rPr>
-        <w:t>So,</w:t>
-      </w:r>
-      <w:r>
-        <w:rPr>
-          <w:lang w:val="en-US"/>
-        </w:rPr>
-        <w:t xml:space="preserve"> the fair objective for standard clustering will be 1 (distance between (0,0) and (0,1) squared), whilst the fair objective for fair clustering will be 0.25 (</w:t>
-      </w:r>
-      <w:r>
-        <w:rPr>
-          <w:lang w:val="en-US"/>
-        </w:rPr>
-        <w:t>distance between (0,0) and (0,1</w:t>
-      </w:r>
-      <w:r>
-        <w:rPr>
-          <w:lang w:val="en-US"/>
-        </w:rPr>
-        <w:t>/2</w:t>
-      </w:r>
-      <w:r>
-        <w:rPr>
-          <w:lang w:val="en-US"/>
-        </w:rPr>
-        <w:t>) squared)</w:t>
-      </w:r>
-      <w:r>
-        <w:rPr>
-          <w:lang w:val="en-US"/>
-        </w:rPr>
-        <w:t>.</w:t>
-      </w:r>
-    </w:p>
-    <w:p>
-      <w:pPr>
-        <w:rPr>
-          <w:lang w:val="en-US"/>
-        </w:rPr>
-      </w:pPr>
-      <w:r>
-        <w:rPr>
-          <w:lang w:val="en-US"/>
-        </w:rPr>
-        <w:t xml:space="preserve">We suggest N to be at least </w:t>
-      </w:r>
-      <w:r>
-        <w:rPr>
-          <w:lang w:val="en-US"/>
-        </w:rPr>
-        <w:t>100*</w:t>
-      </w:r>
-      <w:r>
-        <w:rPr>
-          <w:lang w:val="en-US"/>
-        </w:rPr>
-        <w:t>K</w:t>
-      </w:r>
-      <w:r>
-        <w:rPr>
-          <w:lang w:val="en-US"/>
-        </w:rPr>
-        <w:t xml:space="preserve"> </w:t>
-      </w:r>
-      <w:r>
-        <w:rPr>
-          <w:lang w:val="en-US"/>
-        </w:rPr>
-        <w:t>to s</w:t>
-      </w:r>
-      <w:r>
-        <w:rPr>
-          <w:lang w:val="en-US"/>
-        </w:rPr>
-        <w:t>tart seeing a convergence to the previous argument.</w:t>
+        <w:pStyle w:val="Normal"/>
+        <w:spacing w:before="0" w:after="160"/>
+        <w:rPr>
+          <w:lang w:val="en-US"/>
+        </w:rPr>
+      </w:pPr>
+      <w:r>
+        <w:rPr>
+          <w:lang w:val="en-US"/>
+        </w:rPr>
+        <w:t>We suggest N to be at least 100*K to start seeing a convergence to the previous argument.</w:t>
       </w:r>
     </w:p>
     <w:sectPr>
+      <w:type w:val="nextPage"/>
       <w:pgSz w:w="11906" w:h="16838"/>
-      <w:pgMar w:top="1417" w:right="1134" w:bottom="1134" w:left="1134" w:header="0" w:footer="0" w:gutter="0"/>
-      <w:cols w:space="720"/>
-      <w:formProt w:val="0"/>
-      <w:docGrid w:linePitch="360" w:charSpace="4096"/>
+      <w:pgMar w:left="1134" w:right="1134" w:gutter="0" w:header="0" w:top="1417" w:footer="0" w:bottom="1134"/>
+      <w:pgNumType w:fmt="decimal"/>
+      <w:formProt w:val="false"/>
+      <w:textDirection w:val="lrTb"/>
+      <w:docGrid w:type="default" w:linePitch="360" w:charSpace="8192"/>
     </w:sectPr>
   </w:body>
 </w:document>
 </file>
 
 <file path=word/numbering.xml><?xml version="1.0" encoding="utf-8"?>
-<w:numbering xmlns:wpc="http://schemas.microsoft.com/office/word/2010/wordprocessingCanvas" xmlns:cx="http://schemas.microsoft.com/office/drawing/2014/chartex" xmlns:cx1="http://schemas.microsoft.com/office/drawing/2015/9/8/chartex" xmlns:cx2="http://schemas.microsoft.com/office/drawing/2015/10/21/chartex" xmlns:cx3="http://schemas.microsoft.com/office/drawing/2016/5/9/chartex" xmlns:cx4="http://schemas.microsoft.com/office/drawing/2016/5/10/chartex" xmlns:cx5="http://schemas.microsoft.com/office/drawing/2016/5/11/chartex" xmlns:cx6="http://schemas.microsoft.com/office/drawing/2016/5/12/chartex" xmlns:cx7="http://schemas.microsoft.com/office/drawing/2016/5/13/chartex" xmlns:cx8="http://schemas.microsoft.com/office/drawing/2016/5/14/chartex" xmlns:mc="http://schemas.openxmlformats.org/markup-compatibility/2006" xmlns:aink="http://schemas.microsoft.com/office/drawing/2016/ink" xmlns:am3d="http://schemas.microsoft.com/office/drawing/2017/model3d" xmlns:o="urn:schemas-microsoft-com:office:office" xmlns:oel="http://schemas.microsoft.com/office/2019/extlst" xmlns:r="http://schemas.openxmlformats.org/officeDocument/2006/relationships" xmlns:m="http://schemas.openxmlformats.org/officeDocument/2006/math" xmlns:v="urn:schemas-microsoft-com:vml" xmlns:wp14="http://schemas.microsoft.com/office/word/2010/wordprocessingDrawing" xmlns:wp="http://schemas.openxmlformats.org/drawingml/2006/wordprocessingDrawing" xmlns:w10="urn:schemas-microsoft-com:office:word" xmlns:w="http://schemas.openxmlformats.org/wordprocessingml/2006/main" xmlns:w14="http://schemas.microsoft.com/office/word/2010/wordml" xmlns:w15="http://schemas.microsoft.com/office/word/2012/wordml" xmlns:w16cex="http://schemas.microsoft.com/office/word/2018/wordml/cex" xmlns:w16cid="http://schemas.microsoft.com/office/word/2016/wordml/cid" xmlns:w16="http://schemas.microsoft.com/office/word/2018/wordml" xmlns:w16du="http://schemas.microsoft.com/office/word/2023/wordml/word16du" xmlns:w16sdtdh="http://schemas.microsoft.com/office/word/2020/wordml/sdtdatahash" xmlns:w16sdtfl="http://schemas.microsoft.com/office/word/2024/wordml/sdtformatlock" xmlns:w16se="http://schemas.microsoft.com/office/word/2015/wordml/symex" xmlns:wpg="http://schemas.microsoft.com/office/word/2010/wordprocessingGroup" xmlns:wpi="http://schemas.microsoft.com/office/word/2010/wordprocessingInk" xmlns:wne="http://schemas.microsoft.com/office/word/2006/wordml" xmlns:wps="http://schemas.microsoft.com/office/word/2010/wordprocessingShape" mc:Ignorable="w14 w15 w16se w16cid w16 w16cex w16sdtdh w16sdtfl w16du wp14">
-  <w:abstractNum w:abstractNumId="0" w15:restartNumberingAfterBreak="0">
-    <w:nsid w:val="2D5965CD"/>
-    <w:multiLevelType w:val="multilevel"/>
-    <w:tmpl w:val="7902AE24"/>
+<w:numbering xmlns:w="http://schemas.openxmlformats.org/wordprocessingml/2006/main" xmlns:o="urn:schemas-microsoft-com:office:office" xmlns:r="http://schemas.openxmlformats.org/officeDocument/2006/relationships" xmlns:v="urn:schemas-microsoft-com:vml" xmlns:mc="http://schemas.openxmlformats.org/markup-compatibility/2006" xmlns:w14="http://schemas.microsoft.com/office/word/2010/wordml" mc:Ignorable="w14">
+  <w:abstractNum w:abstractNumId="1">
     <w:lvl w:ilvl="0">
       <w:start w:val="1"/>
       <w:numFmt w:val="bullet"/>
@@ -1149,10 +1405,7 @@
       </w:rPr>
     </w:lvl>
   </w:abstractNum>
-  <w:abstractNum w:abstractNumId="1" w15:restartNumberingAfterBreak="0">
-    <w:nsid w:val="7B5F4406"/>
-    <w:multiLevelType w:val="multilevel"/>
-    <w:tmpl w:val="B8985578"/>
+  <w:abstractNum w:abstractNumId="2">
     <w:lvl w:ilvl="0">
       <w:start w:val="1"/>
       <w:numFmt w:val="none"/>
@@ -1163,7 +1416,7 @@
         <w:tabs>
           <w:tab w:val="num" w:pos="0"/>
         </w:tabs>
-        <w:ind w:left="0" w:firstLine="0"/>
+        <w:ind w:left="0" w:hanging="0"/>
       </w:pPr>
     </w:lvl>
     <w:lvl w:ilvl="1">
@@ -1176,7 +1429,7 @@
         <w:tabs>
           <w:tab w:val="num" w:pos="0"/>
         </w:tabs>
-        <w:ind w:left="0" w:firstLine="0"/>
+        <w:ind w:left="0" w:hanging="0"/>
       </w:pPr>
     </w:lvl>
     <w:lvl w:ilvl="2">
@@ -1189,7 +1442,7 @@
         <w:tabs>
           <w:tab w:val="num" w:pos="0"/>
         </w:tabs>
-        <w:ind w:left="0" w:firstLine="0"/>
+        <w:ind w:left="0" w:hanging="0"/>
       </w:pPr>
     </w:lvl>
     <w:lvl w:ilvl="3">
@@ -1202,7 +1455,7 @@
         <w:tabs>
           <w:tab w:val="num" w:pos="0"/>
         </w:tabs>
-        <w:ind w:left="0" w:firstLine="0"/>
+        <w:ind w:left="0" w:hanging="0"/>
       </w:pPr>
     </w:lvl>
     <w:lvl w:ilvl="4">
@@ -1215,7 +1468,7 @@
         <w:tabs>
           <w:tab w:val="num" w:pos="0"/>
         </w:tabs>
-        <w:ind w:left="0" w:firstLine="0"/>
+        <w:ind w:left="0" w:hanging="0"/>
       </w:pPr>
     </w:lvl>
     <w:lvl w:ilvl="5">
@@ -1228,7 +1481,7 @@
         <w:tabs>
           <w:tab w:val="num" w:pos="0"/>
         </w:tabs>
-        <w:ind w:left="0" w:firstLine="0"/>
+        <w:ind w:left="0" w:hanging="0"/>
       </w:pPr>
     </w:lvl>
     <w:lvl w:ilvl="6">
@@ -1241,7 +1494,7 @@
         <w:tabs>
           <w:tab w:val="num" w:pos="0"/>
         </w:tabs>
-        <w:ind w:left="0" w:firstLine="0"/>
+        <w:ind w:left="0" w:hanging="0"/>
       </w:pPr>
     </w:lvl>
     <w:lvl w:ilvl="7">
@@ -1254,7 +1507,7 @@
         <w:tabs>
           <w:tab w:val="num" w:pos="0"/>
         </w:tabs>
-        <w:ind w:left="0" w:firstLine="0"/>
+        <w:ind w:left="0" w:hanging="0"/>
       </w:pPr>
     </w:lvl>
     <w:lvl w:ilvl="8">
@@ -1267,25 +1520,25 @@
         <w:tabs>
           <w:tab w:val="num" w:pos="0"/>
         </w:tabs>
-        <w:ind w:left="0" w:firstLine="0"/>
+        <w:ind w:left="0" w:hanging="0"/>
       </w:pPr>
     </w:lvl>
   </w:abstractNum>
-  <w:num w:numId="1" w16cid:durableId="1547912501">
-    <w:abstractNumId w:val="0"/>
+  <w:num w:numId="1">
+    <w:abstractNumId w:val="1"/>
   </w:num>
-  <w:num w:numId="2" w16cid:durableId="1607032452">
-    <w:abstractNumId w:val="1"/>
+  <w:num w:numId="2">
+    <w:abstractNumId w:val="2"/>
   </w:num>
 </w:numbering>
 </file>
 
 <file path=word/styles.xml><?xml version="1.0" encoding="utf-8"?>
-<w:styles xmlns:mc="http://schemas.openxmlformats.org/markup-compatibility/2006" xmlns:r="http://schemas.openxmlformats.org/officeDocument/2006/relationships" xmlns:w="http://schemas.openxmlformats.org/wordprocessingml/2006/main" xmlns:w14="http://schemas.microsoft.com/office/word/2010/wordml" xmlns:w15="http://schemas.microsoft.com/office/word/2012/wordml" xmlns:w16cex="http://schemas.microsoft.com/office/word/2018/wordml/cex" xmlns:w16cid="http://schemas.microsoft.com/office/word/2016/wordml/cid" xmlns:w16="http://schemas.microsoft.com/office/word/2018/wordml" xmlns:w16du="http://schemas.microsoft.com/office/word/2023/wordml/word16du" xmlns:w16sdtdh="http://schemas.microsoft.com/office/word/2020/wordml/sdtdatahash" xmlns:w16sdtfl="http://schemas.microsoft.com/office/word/2024/wordml/sdtformatlock" xmlns:w16se="http://schemas.microsoft.com/office/word/2015/wordml/symex" mc:Ignorable="w14 w15 w16se w16cid w16 w16cex w16sdtdh w16sdtfl w16du">
+<w:styles xmlns:w="http://schemas.openxmlformats.org/wordprocessingml/2006/main" xmlns:w14="http://schemas.microsoft.com/office/word/2010/wordml" xmlns:mc="http://schemas.openxmlformats.org/markup-compatibility/2006" mc:Ignorable="w14">
   <w:docDefaults>
     <w:rPrDefault>
       <w:rPr>
-        <w:rFonts w:asciiTheme="minorHAnsi" w:eastAsiaTheme="minorHAnsi" w:hAnsiTheme="minorHAnsi" w:cstheme="minorBidi"/>
+        <w:rFonts w:ascii="Calibri" w:hAnsi="Calibri" w:eastAsia="Calibri" w:cs="" w:asciiTheme="minorHAnsi" w:cstheme="minorBidi" w:eastAsiaTheme="minorHAnsi" w:hAnsiTheme="minorHAnsi"/>
         <w:sz w:val="22"/>
         <w:szCs w:val="22"/>
         <w:lang w:val="it-IT" w:eastAsia="en-US" w:bidi="ar-SA"/>
@@ -1293,21 +1546,21 @@
     </w:rPrDefault>
     <w:pPrDefault>
       <w:pPr>
-        <w:suppressAutoHyphens/>
+        <w:suppressAutoHyphens w:val="true"/>
       </w:pPr>
     </w:pPrDefault>
   </w:docDefaults>
   <w:latentStyles w:defLockedState="0" w:defUIPriority="99" w:defSemiHidden="0" w:defUnhideWhenUsed="0" w:defQFormat="0" w:count="376">
     <w:lsdException w:name="Normal" w:uiPriority="0" w:qFormat="1"/>
     <w:lsdException w:name="heading 1" w:uiPriority="9" w:qFormat="1"/>
-    <w:lsdException w:name="heading 2" w:semiHidden="1" w:uiPriority="9" w:unhideWhenUsed="1" w:qFormat="1"/>
-    <w:lsdException w:name="heading 3" w:semiHidden="1" w:uiPriority="9" w:unhideWhenUsed="1" w:qFormat="1"/>
-    <w:lsdException w:name="heading 4" w:semiHidden="1" w:uiPriority="9" w:unhideWhenUsed="1" w:qFormat="1"/>
-    <w:lsdException w:name="heading 5" w:semiHidden="1" w:uiPriority="9" w:unhideWhenUsed="1" w:qFormat="1"/>
-    <w:lsdException w:name="heading 6" w:semiHidden="1" w:uiPriority="9" w:unhideWhenUsed="1" w:qFormat="1"/>
-    <w:lsdException w:name="heading 7" w:semiHidden="1" w:uiPriority="9" w:unhideWhenUsed="1" w:qFormat="1"/>
-    <w:lsdException w:name="heading 8" w:semiHidden="1" w:uiPriority="9" w:unhideWhenUsed="1" w:qFormat="1"/>
-    <w:lsdException w:name="heading 9" w:semiHidden="1" w:uiPriority="9" w:unhideWhenUsed="1" w:qFormat="1"/>
+    <w:lsdException w:name="heading 2" w:uiPriority="9" w:semiHidden="1" w:unhideWhenUsed="1" w:qFormat="1"/>
+    <w:lsdException w:name="heading 3" w:uiPriority="9" w:semiHidden="1" w:unhideWhenUsed="1" w:qFormat="1"/>
+    <w:lsdException w:name="heading 4" w:uiPriority="9" w:semiHidden="1" w:unhideWhenUsed="1" w:qFormat="1"/>
+    <w:lsdException w:name="heading 5" w:uiPriority="9" w:semiHidden="1" w:unhideWhenUsed="1" w:qFormat="1"/>
+    <w:lsdException w:name="heading 6" w:uiPriority="9" w:semiHidden="1" w:unhideWhenUsed="1" w:qFormat="1"/>
+    <w:lsdException w:name="heading 7" w:uiPriority="9" w:semiHidden="1" w:unhideWhenUsed="1" w:qFormat="1"/>
+    <w:lsdException w:name="heading 8" w:uiPriority="9" w:semiHidden="1" w:unhideWhenUsed="1" w:qFormat="1"/>
+    <w:lsdException w:name="heading 9" w:uiPriority="9" w:semiHidden="1" w:unhideWhenUsed="1" w:qFormat="1"/>
     <w:lsdException w:name="index 1" w:semiHidden="1" w:unhideWhenUsed="1"/>
     <w:lsdException w:name="index 2" w:semiHidden="1" w:unhideWhenUsed="1"/>
     <w:lsdException w:name="index 3" w:semiHidden="1" w:unhideWhenUsed="1"/>
@@ -1317,22 +1570,22 @@
     <w:lsdException w:name="index 7" w:semiHidden="1" w:unhideWhenUsed="1"/>
     <w:lsdException w:name="index 8" w:semiHidden="1" w:unhideWhenUsed="1"/>
     <w:lsdException w:name="index 9" w:semiHidden="1" w:unhideWhenUsed="1"/>
-    <w:lsdException w:name="toc 1" w:semiHidden="1" w:uiPriority="39" w:unhideWhenUsed="1"/>
-    <w:lsdException w:name="toc 2" w:semiHidden="1" w:uiPriority="39" w:unhideWhenUsed="1"/>
-    <w:lsdException w:name="toc 3" w:semiHidden="1" w:uiPriority="39" w:unhideWhenUsed="1"/>
-    <w:lsdException w:name="toc 4" w:semiHidden="1" w:uiPriority="39" w:unhideWhenUsed="1"/>
-    <w:lsdException w:name="toc 5" w:semiHidden="1" w:uiPriority="39" w:unhideWhenUsed="1"/>
-    <w:lsdException w:name="toc 6" w:semiHidden="1" w:uiPriority="39" w:unhideWhenUsed="1"/>
-    <w:lsdException w:name="toc 7" w:semiHidden="1" w:uiPriority="39" w:unhideWhenUsed="1"/>
-    <w:lsdException w:name="toc 8" w:semiHidden="1" w:uiPriority="39" w:unhideWhenUsed="1"/>
-    <w:lsdException w:name="toc 9" w:semiHidden="1" w:uiPriority="39" w:unhideWhenUsed="1"/>
+    <w:lsdException w:name="toc 1" w:uiPriority="39" w:semiHidden="1" w:unhideWhenUsed="1"/>
+    <w:lsdException w:name="toc 2" w:uiPriority="39" w:semiHidden="1" w:unhideWhenUsed="1"/>
+    <w:lsdException w:name="toc 3" w:uiPriority="39" w:semiHidden="1" w:unhideWhenUsed="1"/>
+    <w:lsdException w:name="toc 4" w:uiPriority="39" w:semiHidden="1" w:unhideWhenUsed="1"/>
+    <w:lsdException w:name="toc 5" w:uiPriority="39" w:semiHidden="1" w:unhideWhenUsed="1"/>
+    <w:lsdException w:name="toc 6" w:uiPriority="39" w:semiHidden="1" w:unhideWhenUsed="1"/>
+    <w:lsdException w:name="toc 7" w:uiPriority="39" w:semiHidden="1" w:unhideWhenUsed="1"/>
+    <w:lsdException w:name="toc 8" w:uiPriority="39" w:semiHidden="1" w:unhideWhenUsed="1"/>
+    <w:lsdException w:name="toc 9" w:uiPriority="39" w:semiHidden="1" w:unhideWhenUsed="1"/>
     <w:lsdException w:name="Normal Indent" w:semiHidden="1" w:unhideWhenUsed="1"/>
     <w:lsdException w:name="footnote text" w:semiHidden="1" w:unhideWhenUsed="1"/>
     <w:lsdException w:name="annotation text" w:semiHidden="1" w:unhideWhenUsed="1"/>
     <w:lsdException w:name="header" w:semiHidden="1" w:unhideWhenUsed="1"/>
     <w:lsdException w:name="footer" w:semiHidden="1" w:unhideWhenUsed="1"/>
     <w:lsdException w:name="index heading" w:semiHidden="1" w:unhideWhenUsed="1"/>
-    <w:lsdException w:name="caption" w:semiHidden="1" w:uiPriority="35" w:unhideWhenUsed="1" w:qFormat="1"/>
+    <w:lsdException w:name="caption" w:uiPriority="35" w:semiHidden="1" w:unhideWhenUsed="1" w:qFormat="1"/>
     <w:lsdException w:name="table of figures" w:semiHidden="1" w:unhideWhenUsed="1"/>
     <w:lsdException w:name="envelope address" w:semiHidden="1" w:unhideWhenUsed="1"/>
     <w:lsdException w:name="envelope return" w:semiHidden="1" w:unhideWhenUsed="1"/>
@@ -1363,7 +1616,7 @@
     <w:lsdException w:name="Title" w:uiPriority="10" w:qFormat="1"/>
     <w:lsdException w:name="Closing" w:semiHidden="1" w:unhideWhenUsed="1"/>
     <w:lsdException w:name="Signature" w:semiHidden="1" w:unhideWhenUsed="1"/>
-    <w:lsdException w:name="Default Paragraph Font" w:semiHidden="1" w:uiPriority="1" w:unhideWhenUsed="1"/>
+    <w:lsdException w:name="Default Paragraph Font" w:uiPriority="1" w:semiHidden="1" w:unhideWhenUsed="1"/>
     <w:lsdException w:name="Body Text" w:semiHidden="1" w:unhideWhenUsed="1"/>
     <w:lsdException w:name="Body Text Indent" w:semiHidden="1" w:unhideWhenUsed="1"/>
     <w:lsdException w:name="List Continue" w:semiHidden="1" w:unhideWhenUsed="1"/>
@@ -1563,8 +1816,8 @@
     <w:lsdException w:name="Subtle Reference" w:uiPriority="31" w:qFormat="1"/>
     <w:lsdException w:name="Intense Reference" w:uiPriority="32" w:qFormat="1"/>
     <w:lsdException w:name="Book Title" w:uiPriority="33" w:qFormat="1"/>
-    <w:lsdException w:name="Bibliography" w:semiHidden="1" w:uiPriority="37" w:unhideWhenUsed="1"/>
-    <w:lsdException w:name="TOC Heading" w:semiHidden="1" w:uiPriority="39" w:unhideWhenUsed="1" w:qFormat="1"/>
+    <w:lsdException w:name="Bibliography" w:uiPriority="37" w:semiHidden="1" w:unhideWhenUsed="1"/>
+    <w:lsdException w:name="TOC Heading" w:uiPriority="39" w:semiHidden="1" w:unhideWhenUsed="1" w:qFormat="1"/>
     <w:lsdException w:name="Plain Table 1" w:uiPriority="41"/>
     <w:lsdException w:name="Plain Table 2" w:uiPriority="42"/>
     <w:lsdException w:name="Plain Table 3" w:uiPriority="43"/>
@@ -1675,86 +1928,81 @@
     <w:lsdException w:name="Unresolved Mention" w:semiHidden="1" w:unhideWhenUsed="1"/>
     <w:lsdException w:name="Smart Link" w:semiHidden="1" w:unhideWhenUsed="1"/>
   </w:latentStyles>
-  <w:style w:type="paragraph" w:default="1" w:styleId="Normale">
+  <w:style w:type="paragraph" w:styleId="Normal" w:default="1">
     <w:name w:val="Normal"/>
     <w:qFormat/>
     <w:pPr>
-      <w:spacing w:after="160" w:line="259" w:lineRule="auto"/>
+      <w:widowControl/>
+      <w:suppressAutoHyphens w:val="true"/>
+      <w:bidi w:val="0"/>
+      <w:spacing w:lineRule="auto" w:line="259" w:before="0" w:after="160"/>
+      <w:jc w:val="left"/>
     </w:pPr>
+    <w:rPr>
+      <w:rFonts w:ascii="Calibri" w:hAnsi="Calibri" w:eastAsia="Calibri" w:cs="" w:asciiTheme="minorHAnsi" w:cstheme="minorBidi" w:eastAsiaTheme="minorHAnsi" w:hAnsiTheme="minorHAnsi"/>
+      <w:color w:val="auto"/>
+      <w:kern w:val="0"/>
+      <w:sz w:val="22"/>
+      <w:szCs w:val="22"/>
+      <w:lang w:val="it-IT" w:eastAsia="en-US" w:bidi="ar-SA"/>
+    </w:rPr>
   </w:style>
-  <w:style w:type="character" w:default="1" w:styleId="Carpredefinitoparagrafo">
+  <w:style w:type="character" w:styleId="DefaultParagraphFont" w:default="1">
     <w:name w:val="Default Paragraph Font"/>
     <w:uiPriority w:val="1"/>
     <w:semiHidden/>
     <w:unhideWhenUsed/>
+    <w:qFormat/>
+    <w:rPr/>
   </w:style>
-  <w:style w:type="table" w:default="1" w:styleId="Tabellanormale">
-    <w:name w:val="Normal Table"/>
-    <w:uiPriority w:val="99"/>
-    <w:semiHidden/>
-    <w:unhideWhenUsed/>
-    <w:tblPr>
-      <w:tblInd w:w="0" w:type="dxa"/>
-      <w:tblCellMar>
-        <w:top w:w="0" w:type="dxa"/>
-        <w:left w:w="108" w:type="dxa"/>
-        <w:bottom w:w="0" w:type="dxa"/>
-        <w:right w:w="108" w:type="dxa"/>
-      </w:tblCellMar>
-    </w:tblPr>
-  </w:style>
-  <w:style w:type="numbering" w:default="1" w:styleId="Nessunelenco">
-    <w:name w:val="No List"/>
-    <w:uiPriority w:val="99"/>
-    <w:semiHidden/>
-    <w:unhideWhenUsed/>
-  </w:style>
-  <w:style w:type="character" w:customStyle="1" w:styleId="TestofumettoCarattere">
+  <w:style w:type="character" w:styleId="TestofumettoCarattere" w:customStyle="1">
     <w:name w:val="Testo fumetto Carattere"/>
-    <w:basedOn w:val="Carpredefinitoparagrafo"/>
-    <w:link w:val="Testofumetto"/>
+    <w:basedOn w:val="DefaultParagraphFont"/>
+    <w:link w:val="BalloonText"/>
     <w:uiPriority w:val="99"/>
     <w:semiHidden/>
     <w:qFormat/>
-    <w:rsid w:val="00E94568"/>
+    <w:rsid w:val="00e94568"/>
     <w:rPr>
       <w:rFonts w:ascii="Segoe UI" w:hAnsi="Segoe UI" w:cs="Segoe UI"/>
       <w:sz w:val="18"/>
       <w:szCs w:val="18"/>
     </w:rPr>
   </w:style>
-  <w:style w:type="paragraph" w:customStyle="1" w:styleId="Heading">
+  <w:style w:type="paragraph" w:styleId="Heading" w:customStyle="1">
     <w:name w:val="Heading"/>
-    <w:basedOn w:val="Normale"/>
-    <w:next w:val="Corpotesto"/>
+    <w:basedOn w:val="Normal"/>
+    <w:next w:val="BodyText"/>
     <w:qFormat/>
     <w:pPr>
-      <w:keepNext/>
+      <w:keepNext w:val="true"/>
       <w:spacing w:before="240" w:after="120"/>
     </w:pPr>
     <w:rPr>
-      <w:rFonts w:ascii="Liberation Sans" w:eastAsia="Microsoft YaHei" w:hAnsi="Liberation Sans" w:cs="Lucida Sans"/>
+      <w:rFonts w:ascii="Liberation Sans" w:hAnsi="Liberation Sans" w:eastAsia="Microsoft YaHei" w:cs="Lucida Sans"/>
       <w:sz w:val="28"/>
       <w:szCs w:val="28"/>
     </w:rPr>
   </w:style>
-  <w:style w:type="paragraph" w:styleId="Corpotesto">
+  <w:style w:type="paragraph" w:styleId="BodyText">
     <w:name w:val="Body Text"/>
-    <w:basedOn w:val="Normale"/>
+    <w:basedOn w:val="Normal"/>
     <w:pPr>
-      <w:spacing w:after="140" w:line="276" w:lineRule="auto"/>
+      <w:spacing w:lineRule="auto" w:line="276" w:before="0" w:after="140"/>
     </w:pPr>
+    <w:rPr/>
   </w:style>
-  <w:style w:type="paragraph" w:styleId="Elenco">
+  <w:style w:type="paragraph" w:styleId="List">
     <w:name w:val="List"/>
-    <w:basedOn w:val="Corpotesto"/>
+    <w:basedOn w:val="BodyText"/>
+    <w:pPr/>
     <w:rPr>
       <w:rFonts w:cs="Lucida Sans"/>
     </w:rPr>
   </w:style>
-  <w:style w:type="paragraph" w:styleId="Didascalia">
+  <w:style w:type="paragraph" w:styleId="Caption">
     <w:name w:val="caption"/>
-    <w:basedOn w:val="Normale"/>
+    <w:basedOn w:val="Normal"/>
     <w:qFormat/>
     <w:pPr>
       <w:suppressLineNumbers/>
@@ -1768,9 +2016,9 @@
       <w:szCs w:val="24"/>
     </w:rPr>
   </w:style>
-  <w:style w:type="paragraph" w:customStyle="1" w:styleId="Index">
+  <w:style w:type="paragraph" w:styleId="Index" w:customStyle="1">
     <w:name w:val="Index"/>
-    <w:basedOn w:val="Normale"/>
+    <w:basedOn w:val="Normal"/>
     <w:qFormat/>
     <w:pPr>
       <w:suppressLineNumbers/>
@@ -1779,28 +2027,30 @@
       <w:rFonts w:cs="Lucida Sans"/>
     </w:rPr>
   </w:style>
-  <w:style w:type="paragraph" w:styleId="Paragrafoelenco">
+  <w:style w:type="paragraph" w:styleId="ListParagraph">
     <w:name w:val="List Paragraph"/>
-    <w:basedOn w:val="Normale"/>
+    <w:basedOn w:val="Normal"/>
     <w:uiPriority w:val="34"/>
     <w:qFormat/>
-    <w:rsid w:val="002A5CAC"/>
+    <w:rsid w:val="002a5cac"/>
     <w:pPr>
+      <w:spacing w:before="0" w:after="160"/>
       <w:ind w:left="720"/>
       <w:contextualSpacing/>
     </w:pPr>
+    <w:rPr/>
   </w:style>
-  <w:style w:type="paragraph" w:styleId="Testofumetto">
+  <w:style w:type="paragraph" w:styleId="BalloonText">
     <w:name w:val="Balloon Text"/>
-    <w:basedOn w:val="Normale"/>
+    <w:basedOn w:val="Normal"/>
     <w:link w:val="TestofumettoCarattere"/>
     <w:uiPriority w:val="99"/>
     <w:semiHidden/>
     <w:unhideWhenUsed/>
     <w:qFormat/>
-    <w:rsid w:val="00E94568"/>
+    <w:rsid w:val="00e94568"/>
     <w:pPr>
-      <w:spacing w:after="0" w:line="240" w:lineRule="auto"/>
+      <w:spacing w:lineRule="auto" w:line="240" w:before="0" w:after="0"/>
     </w:pPr>
     <w:rPr>
       <w:rFonts w:ascii="Segoe UI" w:hAnsi="Segoe UI" w:cs="Segoe UI"/>
@@ -1808,16 +2058,17 @@
       <w:szCs w:val="18"/>
     </w:rPr>
   </w:style>
-  <w:style w:type="paragraph" w:customStyle="1" w:styleId="TableContents">
+  <w:style w:type="paragraph" w:styleId="TableContents" w:customStyle="1">
     <w:name w:val="Table Contents"/>
-    <w:basedOn w:val="Normale"/>
+    <w:basedOn w:val="Normal"/>
     <w:qFormat/>
     <w:pPr>
-      <w:widowControl w:val="0"/>
+      <w:widowControl w:val="false"/>
       <w:suppressLineNumbers/>
     </w:pPr>
+    <w:rPr/>
   </w:style>
-  <w:style w:type="paragraph" w:customStyle="1" w:styleId="TableHeading">
+  <w:style w:type="paragraph" w:styleId="TableHeading" w:customStyle="1">
     <w:name w:val="Table Heading"/>
     <w:basedOn w:val="TableContents"/>
     <w:qFormat/>
@@ -1829,19 +2080,40 @@
       <w:bCs/>
     </w:rPr>
   </w:style>
+  <w:style w:type="numbering" w:styleId="NoList" w:default="1">
+    <w:name w:val="No List"/>
+    <w:uiPriority w:val="99"/>
+    <w:semiHidden/>
+    <w:unhideWhenUsed/>
+    <w:qFormat/>
+  </w:style>
+  <w:style w:type="table" w:default="1" w:styleId="Tabellanormale">
+    <w:name w:val="Normal Table"/>
+    <w:uiPriority w:val="99"/>
+    <w:semiHidden/>
+    <w:unhideWhenUsed/>
+    <w:tblPr>
+      <w:tblCellMar>
+        <w:top w:w="0" w:type="dxa"/>
+        <w:left w:w="108" w:type="dxa"/>
+        <w:bottom w:w="0" w:type="dxa"/>
+        <w:right w:w="108" w:type="dxa"/>
+      </w:tblCellMar>
+    </w:tblPr>
+  </w:style>
   <w:style w:type="table" w:styleId="Grigliatabella">
     <w:name w:val="Table Grid"/>
     <w:basedOn w:val="Tabellanormale"/>
     <w:uiPriority w:val="39"/>
-    <w:rsid w:val="006B790B"/>
+    <w:rsid w:val="006b790b"/>
     <w:tblPr>
       <w:tblBorders>
-        <w:top w:val="single" w:sz="4" w:space="0" w:color="auto"/>
-        <w:left w:val="single" w:sz="4" w:space="0" w:color="auto"/>
-        <w:bottom w:val="single" w:sz="4" w:space="0" w:color="auto"/>
-        <w:right w:val="single" w:sz="4" w:space="0" w:color="auto"/>
-        <w:insideH w:val="single" w:sz="4" w:space="0" w:color="auto"/>
-        <w:insideV w:val="single" w:sz="4" w:space="0" w:color="auto"/>
+        <w:top w:val="single" w:color="auto" w:sz="4" w:space="0"/>
+        <w:left w:val="single" w:color="auto" w:sz="4" w:space="0"/>
+        <w:bottom w:val="single" w:color="auto" w:sz="4" w:space="0"/>
+        <w:right w:val="single" w:color="auto" w:sz="4" w:space="0"/>
+        <w:insideH w:val="single" w:color="auto" w:sz="4" w:space="0"/>
+        <w:insideV w:val="single" w:color="auto" w:sz="4" w:space="0"/>
       </w:tblBorders>
     </w:tblPr>
   </w:style>
@@ -1849,54 +2121,54 @@
 </file>
 
 <file path=word/theme/theme1.xml><?xml version="1.0" encoding="utf-8"?>
-<a:theme xmlns:a="http://schemas.openxmlformats.org/drawingml/2006/main" name="Tema di Office">
+<a:theme xmlns:a="http://schemas.openxmlformats.org/drawingml/2006/main" xmlns:r="http://schemas.openxmlformats.org/officeDocument/2006/relationships" name="Tema di Office">
   <a:themeElements>
     <a:clrScheme name="Office">
       <a:dk1>
         <a:srgbClr val="000000"/>
       </a:dk1>
       <a:lt1>
-        <a:srgbClr val="FFFFFF"/>
+        <a:srgbClr val="ffffff"/>
       </a:lt1>
       <a:dk2>
-        <a:srgbClr val="44546A"/>
+        <a:srgbClr val="44546a"/>
       </a:dk2>
       <a:lt2>
-        <a:srgbClr val="E7E6E6"/>
+        <a:srgbClr val="e7e6e6"/>
       </a:lt2>
       <a:accent1>
-        <a:srgbClr val="5B9BD5"/>
+        <a:srgbClr val="5b9bd5"/>
       </a:accent1>
       <a:accent2>
-        <a:srgbClr val="ED7D31"/>
+        <a:srgbClr val="ed7d31"/>
       </a:accent2>
       <a:accent3>
-        <a:srgbClr val="A5A5A5"/>
+        <a:srgbClr val="a5a5a5"/>
       </a:accent3>
       <a:accent4>
-        <a:srgbClr val="FFC000"/>
+        <a:srgbClr val="ffc000"/>
       </a:accent4>
       <a:accent5>
-        <a:srgbClr val="4472C4"/>
+        <a:srgbClr val="4472c4"/>
       </a:accent5>
       <a:accent6>
-        <a:srgbClr val="70AD47"/>
+        <a:srgbClr val="70ad47"/>
       </a:accent6>
       <a:hlink>
-        <a:srgbClr val="0563C1"/>
+        <a:srgbClr val="0563c1"/>
       </a:hlink>
       <a:folHlink>
-        <a:srgbClr val="954F72"/>
+        <a:srgbClr val="954f72"/>
       </a:folHlink>
     </a:clrScheme>
     <a:fontScheme name="Office">
       <a:majorFont>
-        <a:latin typeface="Calibri Light" panose="020F0302020204030204"/>
+        <a:latin typeface="Calibri Light" panose="020F0302020204030204" pitchFamily="0" charset="1"/>
         <a:ea typeface=""/>
         <a:cs typeface=""/>
       </a:majorFont>
       <a:minorFont>
-        <a:latin typeface="Calibri" panose="020F0502020204030204"/>
+        <a:latin typeface="Calibri" panose="020F0502020204030204" pitchFamily="0" charset="1"/>
         <a:ea typeface=""/>
         <a:cs typeface=""/>
       </a:minorFont>
@@ -1928,7 +2200,7 @@
             </a:gs>
           </a:gsLst>
           <a:lin ang="5400000" scaled="0"/>
-          <a:tileRect/>
+          <a:tileRect l="0" t="0" r="0" b="0"/>
         </a:gradFill>
         <a:gradFill>
           <a:gsLst>
@@ -1952,7 +2224,7 @@
             </a:gs>
           </a:gsLst>
           <a:lin ang="5400000" scaled="0"/>
-          <a:tileRect/>
+          <a:tileRect l="0" t="0" r="0" b="0"/>
         </a:gradFill>
       </a:fillStyleLst>
       <a:lnStyleLst>
@@ -2012,12 +2284,10 @@
             </a:gs>
           </a:gsLst>
           <a:lin ang="5400000" scaled="0"/>
-          <a:tileRect/>
+          <a:tileRect l="0" t="0" r="0" b="0"/>
         </a:gradFill>
       </a:bgFillStyleLst>
     </a:fmtScheme>
   </a:themeElements>
-  <a:objectDefaults/>
-  <a:extraClrSchemeLst/>
 </a:theme>
 </file>
</xml_diff>